<commit_message>
ajouts dans le .docx, pull du prof
</commit_message>
<xml_diff>
--- a/Tp1-prog-avancee-partie1.docx
+++ b/Tp1-prog-avancee-partie1.docx
@@ -69,45 +69,22 @@
         <w:pStyle w:val="Titre3"/>
       </w:pPr>
       <w:r>
-        <w:t xml:space="preserve">Analyse des besoins : Agence </w:t>
-      </w:r>
-      <w:r>
-        <w:t>financière</w:t>
-      </w:r>
-      <w:r>
-        <w:t xml:space="preserve"> </w:t>
-      </w:r>
-      <w:r>
-        <w:t>immobilière</w:t>
-      </w:r>
-    </w:p>
-    <w:p>
-      <w:pPr>
-        <w:rPr>
-          <w:b/>
-          <w:bCs/>
-        </w:rPr>
-      </w:pPr>
-      <w:r>
-        <w:rPr>
-          <w:b/>
-          <w:bCs/>
-        </w:rPr>
-        <w:t>Fonctionnalités</w:t>
-      </w:r>
-      <w:r>
-        <w:rPr>
-          <w:b/>
-          <w:bCs/>
-        </w:rPr>
-        <w:t xml:space="preserve"> obligatoires</w:t>
-      </w:r>
-      <w:r>
-        <w:rPr>
-          <w:b/>
-          <w:bCs/>
-        </w:rPr>
-        <w:t> :</w:t>
+        <w:t>Analyse des besoins : Agence financière immobilière</w:t>
+      </w:r>
+    </w:p>
+    <w:p>
+      <w:pPr>
+        <w:rPr>
+          <w:b/>
+          <w:bCs/>
+        </w:rPr>
+      </w:pPr>
+      <w:r>
+        <w:rPr>
+          <w:b/>
+          <w:bCs/>
+        </w:rPr>
+        <w:t>Fonctionnalités obligatoires :</w:t>
       </w:r>
     </w:p>
     <w:p>
@@ -131,110 +108,76 @@
           <w:i/>
           <w:iCs/>
         </w:rPr>
-        <w:t xml:space="preserve">Le site doit permettre </w:t>
-      </w:r>
-      <w:r>
-        <w:rPr>
-          <w:b/>
-          <w:bCs/>
-          <w:i/>
-          <w:iCs/>
-        </w:rPr>
-        <w:t>à</w:t>
-      </w:r>
-      <w:r>
-        <w:rPr>
-          <w:b/>
-          <w:bCs/>
-          <w:i/>
-          <w:iCs/>
-        </w:rPr>
-        <w:t xml:space="preserve"> l'utilisateur de naviguer entre les sections Accueil, Projets, Services, A propos et Nous joindre.</w:t>
-      </w:r>
-      <w:r>
-        <w:rPr>
-          <w:b/>
-          <w:bCs/>
-          <w:i/>
-          <w:iCs/>
-        </w:rPr>
+        <w:t xml:space="preserve">Le site doit permettre à l'utilisateur de naviguer entre les sections Accueil, Projets, Services, A propos et Nous joindre. </w:t>
+      </w:r>
+    </w:p>
+    <w:p>
+      <w:r>
+        <w:t>Cas d'utilisation : Navigation entre les sections</w:t>
+      </w:r>
+    </w:p>
+    <w:p>
+      <w:r>
+        <w:t>Acteur : utilisateur</w:t>
+      </w:r>
+    </w:p>
+    <w:p>
+      <w:r>
+        <w:t xml:space="preserve">Déclencheur : l'utilisateur clique sur un lien de section dans la </w:t>
+      </w:r>
+      <w:proofErr w:type="spellStart"/>
+      <w:r>
+        <w:t>NavBar</w:t>
+      </w:r>
+      <w:proofErr w:type="spellEnd"/>
+      <w:r>
+        <w:t xml:space="preserve"> (Accueil, Projets, Services, À propos, Nous</w:t>
+      </w:r>
+      <w:r>
         <w:t xml:space="preserve"> </w:t>
       </w:r>
-    </w:p>
-    <w:p>
-      <w:r>
-        <w:t xml:space="preserve">Cas d'utilisation : Consultation de la </w:t>
-      </w:r>
-      <w:r>
-        <w:t>présentation</w:t>
-      </w:r>
-      <w:r>
-        <w:t xml:space="preserve"> de l'agence</w:t>
-      </w:r>
-    </w:p>
-    <w:p>
-      <w:r>
-        <w:t>Acteur : utilisateur</w:t>
-      </w:r>
-    </w:p>
-    <w:p>
-      <w:r>
-        <w:t>Déclencheur</w:t>
-      </w:r>
-      <w:r>
-        <w:t xml:space="preserve"> : l'utilisateur ouvre le site ou clique sur la section Accueil</w:t>
-      </w:r>
-    </w:p>
-    <w:p>
-      <w:r>
-        <w:t>Contraintes : aucune, contenu statique disponible sans condition</w:t>
-      </w:r>
-    </w:p>
-    <w:p>
-      <w:r>
-        <w:t>Déroulement</w:t>
-      </w:r>
-      <w:r>
-        <w:t xml:space="preserve"> : </w:t>
-      </w:r>
-    </w:p>
-    <w:p>
-      <w:r>
-        <w:t>Si</w:t>
-      </w:r>
-      <w:r>
-        <w:t xml:space="preserve"> la section Accueil est active, alors </w:t>
-      </w:r>
-    </w:p>
-    <w:p>
-      <w:pPr>
-        <w:ind w:firstLine="360"/>
-      </w:pPr>
-      <w:r>
-        <w:t>Le</w:t>
-      </w:r>
-      <w:r>
-        <w:t xml:space="preserve"> texte de </w:t>
-      </w:r>
-      <w:r>
-        <w:t>présentation</w:t>
-      </w:r>
-      <w:r>
-        <w:t xml:space="preserve"> et la vue d'ensemble des </w:t>
-      </w:r>
-      <w:r>
-        <w:t>activités</w:t>
-      </w:r>
-      <w:r>
-        <w:t xml:space="preserve"> s'affichent; </w:t>
-      </w:r>
-    </w:p>
-    <w:p>
-      <w:r>
-        <w:t>Sinon</w:t>
-      </w:r>
-      <w:r>
-        <w:t xml:space="preserve"> ce contenu reste masque</w:t>
+      <w:r>
+        <w:t>joindre)</w:t>
+      </w:r>
+    </w:p>
+    <w:p>
+      <w:r>
+        <w:t>Contraintes : la section active doit exister dans le state de l'application (App)</w:t>
+      </w:r>
+    </w:p>
+    <w:p>
+      <w:r>
+        <w:t>Déroulement :</w:t>
+      </w:r>
+    </w:p>
+    <w:p>
+      <w:r>
+        <w:t>S</w:t>
+      </w:r>
+      <w:r>
+        <w:t>i la section cliquée est différente de la section active,</w:t>
+      </w:r>
+    </w:p>
+    <w:p>
+      <w:pPr>
+        <w:ind w:firstLine="708"/>
+      </w:pPr>
+      <w:r>
+        <w:t>Alors le state de la section active est mis à jour, le contenu de la nouvelle section s'affiche, le contenu de l'ancienne section est masqué, et le lien de la nouvelle section devient visuellement</w:t>
+      </w:r>
+      <w:r>
+        <w:t xml:space="preserve"> </w:t>
+      </w:r>
+      <w:r>
+        <w:t>actif</w:t>
+      </w:r>
+      <w:r>
+        <w:t>,</w:t>
+      </w:r>
+    </w:p>
+    <w:p>
+      <w:r>
+        <w:t xml:space="preserve">  Sinon, si l'utilisateur clique sur la section déjà active, aucun changement ne se produit.</w:t>
       </w:r>
     </w:p>
     <w:p>
@@ -256,89 +199,19 @@
           <w:i/>
           <w:iCs/>
         </w:rPr>
-        <w:t xml:space="preserve">Le site doit permettre </w:t>
-      </w:r>
-      <w:r>
-        <w:rPr>
-          <w:b/>
-          <w:bCs/>
+        <w:t>Le site doit permettre à l'utilisateur de consulter une présentation générale de l'agence et de ses activités</w:t>
+      </w:r>
+      <w:r>
+        <w:rPr>
           <w:i/>
           <w:iCs/>
         </w:rPr>
-        <w:t>à</w:t>
-      </w:r>
-      <w:r>
-        <w:rPr>
-          <w:b/>
-          <w:bCs/>
-          <w:i/>
-          <w:iCs/>
-        </w:rPr>
-        <w:t xml:space="preserve"> l'utilisateur de consulter une </w:t>
-      </w:r>
-      <w:r>
-        <w:rPr>
-          <w:b/>
-          <w:bCs/>
-          <w:i/>
-          <w:iCs/>
-        </w:rPr>
-        <w:t>présentation</w:t>
-      </w:r>
-      <w:r>
-        <w:rPr>
-          <w:b/>
-          <w:bCs/>
-          <w:i/>
-          <w:iCs/>
-        </w:rPr>
-        <w:t xml:space="preserve"> </w:t>
-      </w:r>
-      <w:r>
-        <w:rPr>
-          <w:b/>
-          <w:bCs/>
-          <w:i/>
-          <w:iCs/>
-        </w:rPr>
-        <w:t>générale</w:t>
-      </w:r>
-      <w:r>
-        <w:rPr>
-          <w:b/>
-          <w:bCs/>
-          <w:i/>
-          <w:iCs/>
-        </w:rPr>
-        <w:t xml:space="preserve"> de l'agence et de ses </w:t>
-      </w:r>
-      <w:r>
-        <w:rPr>
-          <w:b/>
-          <w:bCs/>
-          <w:i/>
-          <w:iCs/>
-        </w:rPr>
-        <w:t>activités</w:t>
-      </w:r>
-      <w:r>
-        <w:rPr>
-          <w:i/>
-          <w:iCs/>
-        </w:rPr>
-        <w:t>.</w:t>
-      </w:r>
-      <w:r>
-        <w:rPr>
-          <w:i/>
-          <w:iCs/>
-        </w:rPr>
-        <w:t xml:space="preserve"> </w:t>
-      </w:r>
-    </w:p>
-    <w:p>
-      <w:r>
-        <w:t>Cas d'utilisation : Consultation de la liste des projets</w:t>
+        <w:t xml:space="preserve">. </w:t>
+      </w:r>
+    </w:p>
+    <w:p>
+      <w:r>
+        <w:t>Cas d'utilisation : Consultation de la présentation de l'agence</w:t>
       </w:r>
     </w:p>
     <w:p>
@@ -348,54 +221,36 @@
     </w:p>
     <w:p>
       <w:r>
-        <w:t>Déclencheur</w:t>
-      </w:r>
-      <w:r>
-        <w:t xml:space="preserve"> : l'utilisateur clique sur la section Projets</w:t>
-      </w:r>
-    </w:p>
-    <w:p>
-      <w:r>
-        <w:t>Contraintes : la liste des projets doit exister dans le state de l'application</w:t>
-      </w:r>
-    </w:p>
-    <w:p>
-      <w:r>
-        <w:t>Déroulement</w:t>
-      </w:r>
-      <w:r>
-        <w:t xml:space="preserve"> : </w:t>
-      </w:r>
-    </w:p>
-    <w:p>
-      <w:r>
-        <w:t>S</w:t>
-      </w:r>
-      <w:r>
-        <w:t xml:space="preserve">i la section Projets est active, alors </w:t>
-      </w:r>
-    </w:p>
-    <w:p>
-      <w:pPr>
-        <w:ind w:firstLine="360"/>
-      </w:pPr>
-      <w:r>
-        <w:t>L</w:t>
-      </w:r>
-      <w:r>
-        <w:t xml:space="preserve">a liste des projets actuellement disponibles s'affiche sous forme de cartes; </w:t>
-      </w:r>
-    </w:p>
-    <w:p>
-      <w:pPr>
-        <w:ind w:firstLine="360"/>
-      </w:pPr>
+        <w:t>Déclencheur : l'utilisateur clique sur la section Accueil (ou ouvre le site, Accueil est la section affichée par défaut)</w:t>
+      </w:r>
+    </w:p>
+    <w:p>
+      <w:r>
+        <w:t>Contraintes : aucune, contenu statique disponible sans condition</w:t>
+      </w:r>
+    </w:p>
+    <w:p>
+      <w:r>
+        <w:t>Déroulement :</w:t>
+      </w:r>
+    </w:p>
+    <w:p>
       <w:r>
         <w:lastRenderedPageBreak/>
-        <w:t>S</w:t>
-      </w:r>
-      <w:r>
-        <w:t>inon, une liste vide s'affiche</w:t>
+        <w:t>Si la section Accueil est active,</w:t>
+      </w:r>
+    </w:p>
+    <w:p>
+      <w:pPr>
+        <w:ind w:firstLine="708"/>
+      </w:pPr>
+      <w:r>
+        <w:t>Alors le texte de présentation de l'agence et la vue d'ensemble de ses activités s'affichent;</w:t>
+      </w:r>
+    </w:p>
+    <w:p>
+      <w:r>
+        <w:t>Sinon, ce contenu reste masqué.</w:t>
       </w:r>
     </w:p>
     <w:p>
@@ -419,30 +274,12 @@
           <w:i/>
           <w:iCs/>
         </w:rPr>
-        <w:t xml:space="preserve">Le site doit permettre </w:t>
-      </w:r>
-      <w:r>
-        <w:rPr>
-          <w:b/>
-          <w:bCs/>
-          <w:i/>
-          <w:iCs/>
-        </w:rPr>
-        <w:t>à</w:t>
-      </w:r>
-      <w:r>
-        <w:rPr>
-          <w:b/>
-          <w:bCs/>
-          <w:i/>
-          <w:iCs/>
-        </w:rPr>
-        <w:t xml:space="preserve"> l'utilisateur de consulter la liste des projets immobiliers disponibles.</w:t>
-      </w:r>
-    </w:p>
-    <w:p>
-      <w:r>
-        <w:t>Cas d'utilisation : Consultation des informations d'un projet</w:t>
+        <w:t>Le site doit permettre à l'utilisateur de consulter la liste des projets immobiliers disponibles.</w:t>
+      </w:r>
+    </w:p>
+    <w:p>
+      <w:r>
+        <w:t>Cas d'utilisation : Consultation de la liste des projets</w:t>
       </w:r>
     </w:p>
     <w:p>
@@ -452,29 +289,17 @@
     </w:p>
     <w:p>
       <w:r>
-        <w:t>Déclencheur</w:t>
-      </w:r>
-      <w:r>
-        <w:t xml:space="preserve"> : l'utilisateur regarde une carte de projet dans la liste </w:t>
-      </w:r>
-      <w:r>
-        <w:t>affichée</w:t>
-      </w:r>
-    </w:p>
-    <w:p>
-      <w:r>
-        <w:t xml:space="preserve">Contraintes : le projet doit contenir toutes les informations minimales </w:t>
-      </w:r>
-      <w:r>
-        <w:t>exigées</w:t>
-      </w:r>
-    </w:p>
-    <w:p>
-      <w:r>
-        <w:t>Déroulement</w:t>
-      </w:r>
-      <w:r>
-        <w:t xml:space="preserve"> : </w:t>
+        <w:t>Déclencheur : l'utilisateur clique sur la section Projets</w:t>
+      </w:r>
+    </w:p>
+    <w:p>
+      <w:r>
+        <w:t>Contraintes : la liste des projets doit exister dans le state de l'application</w:t>
+      </w:r>
+    </w:p>
+    <w:p>
+      <w:r>
+        <w:t xml:space="preserve">Déroulement : </w:t>
       </w:r>
     </w:p>
     <w:p>
@@ -482,30 +307,18 @@
         <w:t>S</w:t>
       </w:r>
       <w:r>
-        <w:t xml:space="preserve">i la carte du projet est </w:t>
-      </w:r>
-      <w:r>
-        <w:t>affichée</w:t>
-      </w:r>
-      <w:r>
-        <w:t xml:space="preserve">, </w:t>
-      </w:r>
-    </w:p>
-    <w:p>
-      <w:pPr>
-        <w:ind w:left="360"/>
-      </w:pPr>
-      <w:r>
-        <w:t>Alors</w:t>
-      </w:r>
-      <w:r>
-        <w:t xml:space="preserve"> le titre, la ville, le type, le statut, la description, l'information </w:t>
-      </w:r>
-      <w:r>
-        <w:t>financière</w:t>
-      </w:r>
-      <w:r>
-        <w:t xml:space="preserve"> ou de superficie et l'image sont visibles; </w:t>
+        <w:t xml:space="preserve">i la section Projets est active, alors </w:t>
+      </w:r>
+    </w:p>
+    <w:p>
+      <w:pPr>
+        <w:ind w:firstLine="708"/>
+      </w:pPr>
+      <w:r>
+        <w:t>L</w:t>
+      </w:r>
+      <w:r>
+        <w:t xml:space="preserve">a liste des projets actuellement disponibles s'affiche sous forme de cartes; </w:t>
       </w:r>
     </w:p>
     <w:p>
@@ -513,10 +326,7 @@
         <w:t>S</w:t>
       </w:r>
       <w:r>
-        <w:t xml:space="preserve">inon, </w:t>
-      </w:r>
-      <w:r>
-        <w:t>s’affiche Alert!</w:t>
+        <w:t>inon, une liste vide s'affiche</w:t>
       </w:r>
     </w:p>
     <w:p>
@@ -540,25 +350,7 @@
           <w:i/>
           <w:iCs/>
         </w:rPr>
-        <w:t xml:space="preserve">Le site doit permettre </w:t>
-      </w:r>
-      <w:r>
-        <w:rPr>
-          <w:b/>
-          <w:bCs/>
-          <w:i/>
-          <w:iCs/>
-        </w:rPr>
-        <w:t>à</w:t>
-      </w:r>
-      <w:r>
-        <w:rPr>
-          <w:b/>
-          <w:bCs/>
-          <w:i/>
-          <w:iCs/>
-        </w:rPr>
-        <w:t xml:space="preserve"> l'utilisateur de consulter les informations essentielles de chaque projet.</w:t>
+        <w:t>Le site doit permettre à l'utilisateur de consulter les informations essentielles de chaque projet.</w:t>
       </w:r>
     </w:p>
     <w:p>
@@ -573,29 +365,17 @@
     </w:p>
     <w:p>
       <w:r>
-        <w:t>Déclencheur</w:t>
-      </w:r>
-      <w:r>
-        <w:t xml:space="preserve"> : l'utilisateur regarde une carte de projet dans la liste </w:t>
-      </w:r>
-      <w:r>
-        <w:t>affichée</w:t>
-      </w:r>
-    </w:p>
-    <w:p>
-      <w:r>
-        <w:t xml:space="preserve">Contraintes : le projet doit contenir toutes les informations minimales </w:t>
-      </w:r>
-      <w:r>
-        <w:t>exigées</w:t>
-      </w:r>
-    </w:p>
-    <w:p>
-      <w:r>
-        <w:t>Déroulement</w:t>
-      </w:r>
-      <w:r>
-        <w:t xml:space="preserve"> : </w:t>
+        <w:t>Déclencheur : l'utilisateur regarde une carte de projet dans la liste affichée</w:t>
+      </w:r>
+    </w:p>
+    <w:p>
+      <w:r>
+        <w:t>Contraintes : le projet doit contenir toutes les informations minimales exigées</w:t>
+      </w:r>
+    </w:p>
+    <w:p>
+      <w:r>
+        <w:t xml:space="preserve">Déroulement : </w:t>
       </w:r>
     </w:p>
     <w:p>
@@ -603,13 +383,7 @@
         <w:t>S</w:t>
       </w:r>
       <w:r>
-        <w:t xml:space="preserve">i la carte du projet est </w:t>
-      </w:r>
-      <w:r>
-        <w:t>affichée</w:t>
-      </w:r>
-      <w:r>
-        <w:t xml:space="preserve">, </w:t>
+        <w:t xml:space="preserve">i la carte du projet est affichée, </w:t>
       </w:r>
     </w:p>
     <w:p>
@@ -617,16 +391,7 @@
         <w:ind w:firstLine="708"/>
       </w:pPr>
       <w:r>
-        <w:t>Alors</w:t>
-      </w:r>
-      <w:r>
-        <w:t xml:space="preserve"> le titre, la ville, le type, le statut, la description, l'information </w:t>
-      </w:r>
-      <w:r>
-        <w:t>financière</w:t>
-      </w:r>
-      <w:r>
-        <w:t xml:space="preserve"> ou de superficie et l'image sont visibles;</w:t>
+        <w:t>Alors le titre, la ville, le type, le statut, la description, l'information financière ou de superficie et l'image sont visibles;</w:t>
       </w:r>
     </w:p>
     <w:p>
@@ -661,7 +426,7 @@
           <w:i/>
           <w:iCs/>
         </w:rPr>
-        <w:t xml:space="preserve">Le site doit permettre </w:t>
+        <w:t>Le site doit permettre à l'utilisateur de filtrer les projets affiches selon un critère pertinent, par exemple le type de projet ou son statut.</w:t>
       </w:r>
       <w:r>
         <w:rPr>
@@ -670,42 +435,6 @@
           <w:i/>
           <w:iCs/>
         </w:rPr>
-        <w:t>à</w:t>
-      </w:r>
-      <w:r>
-        <w:rPr>
-          <w:b/>
-          <w:bCs/>
-          <w:i/>
-          <w:iCs/>
-        </w:rPr>
-        <w:t xml:space="preserve"> l'utilisateur de filtrer les projets affiches selon un </w:t>
-      </w:r>
-      <w:r>
-        <w:rPr>
-          <w:b/>
-          <w:bCs/>
-          <w:i/>
-          <w:iCs/>
-        </w:rPr>
-        <w:t>critère</w:t>
-      </w:r>
-      <w:r>
-        <w:rPr>
-          <w:b/>
-          <w:bCs/>
-          <w:i/>
-          <w:iCs/>
-        </w:rPr>
-        <w:t xml:space="preserve"> pertinent, par exemple le type de projet ou son statut.</w:t>
-      </w:r>
-      <w:r>
-        <w:rPr>
-          <w:b/>
-          <w:bCs/>
-          <w:i/>
-          <w:iCs/>
-        </w:rPr>
         <w:t xml:space="preserve"> </w:t>
       </w:r>
     </w:p>
@@ -731,12 +460,12 @@
     </w:p>
     <w:p>
       <w:r>
+        <w:lastRenderedPageBreak/>
         <w:t xml:space="preserve">Déroulement : </w:t>
       </w:r>
     </w:p>
     <w:p>
       <w:r>
-        <w:lastRenderedPageBreak/>
         <w:t xml:space="preserve">Si des projets correspondent au critère choisi, </w:t>
       </w:r>
     </w:p>
@@ -825,34 +554,22 @@
     </w:p>
     <w:p>
       <w:r>
-        <w:t>Déclencheur</w:t>
-      </w:r>
-      <w:r>
-        <w:t xml:space="preserve"> : l'utilisateur clique sur le bouton de retrait d'une carte de projet</w:t>
-      </w:r>
-    </w:p>
-    <w:p>
-      <w:r>
-        <w:t xml:space="preserve">Contraintes : le projet doit encore exister dans la liste </w:t>
-      </w:r>
-      <w:r>
-        <w:t>affichée</w:t>
-      </w:r>
-    </w:p>
-    <w:p>
-      <w:r>
-        <w:t>Déroulement</w:t>
-      </w:r>
-      <w:r>
-        <w:t xml:space="preserve"> : </w:t>
-      </w:r>
-    </w:p>
-    <w:p>
-      <w:r>
-        <w:t>S</w:t>
-      </w:r>
-      <w:r>
-        <w:t xml:space="preserve">i l'utilisateur clique sur le bouton, </w:t>
+        <w:t>Déclencheur : l'utilisateur clique sur le bouton de retrait d'une carte de projet</w:t>
+      </w:r>
+    </w:p>
+    <w:p>
+      <w:r>
+        <w:t>Contraintes : le projet doit encore exister dans la liste affichée</w:t>
+      </w:r>
+    </w:p>
+    <w:p>
+      <w:r>
+        <w:t xml:space="preserve">Déroulement : </w:t>
+      </w:r>
+    </w:p>
+    <w:p>
+      <w:r>
+        <w:t xml:space="preserve">Si l'utilisateur clique sur le bouton, </w:t>
       </w:r>
     </w:p>
     <w:p>
@@ -863,19 +580,15 @@
         <w:t>Alors</w:t>
       </w:r>
       <w:r>
-        <w:t xml:space="preserve"> une nouvelle liste sans ce projet est </w:t>
-      </w:r>
-      <w:r>
-        <w:t>créée</w:t>
-      </w:r>
-      <w:r>
-        <w:t xml:space="preserve"> avec </w:t>
-      </w:r>
-      <w:r>
-        <w:t>filtre</w:t>
-      </w:r>
-      <w:r>
-        <w:t xml:space="preserve">() et </w:t>
+        <w:t xml:space="preserve"> une nouvelle liste sans ce projet est créée avec </w:t>
+      </w:r>
+      <w:proofErr w:type="gramStart"/>
+      <w:r>
+        <w:t>filtre(</w:t>
+      </w:r>
+      <w:proofErr w:type="gramEnd"/>
+      <w:r>
+        <w:t xml:space="preserve">) et </w:t>
       </w:r>
       <w:r>
         <w:t>remplace le</w:t>
@@ -901,7 +614,13 @@
         <w:t>été</w:t>
       </w:r>
       <w:r>
-        <w:t xml:space="preserve"> retire, le bouton n'a plus d'effet</w:t>
+        <w:t xml:space="preserve"> </w:t>
+      </w:r>
+      <w:r>
+        <w:t>retiré</w:t>
+      </w:r>
+      <w:r>
+        <w:t>, le bouton n'a plus d'effet</w:t>
       </w:r>
     </w:p>
     <w:p>
@@ -976,10 +695,7 @@
     </w:p>
     <w:p>
       <w:r>
-        <w:t>Déclencheur</w:t>
-      </w:r>
-      <w:r>
-        <w:t xml:space="preserve"> : l'utilisateur clique sur la section Nous joindre</w:t>
+        <w:t>Déclencheur : l'utilisateur clique sur la section Nous joindre</w:t>
       </w:r>
     </w:p>
     <w:p>
@@ -989,10 +705,7 @@
     </w:p>
     <w:p>
       <w:r>
-        <w:t>Déroulement</w:t>
-      </w:r>
-      <w:r>
-        <w:t xml:space="preserve"> : </w:t>
+        <w:t xml:space="preserve">Déroulement : </w:t>
       </w:r>
     </w:p>
     <w:p>
@@ -1011,13 +724,7 @@
         <w:t>A</w:t>
       </w:r>
       <w:r>
-        <w:t xml:space="preserve">lors les </w:t>
-      </w:r>
-      <w:r>
-        <w:t>coordonnées</w:t>
-      </w:r>
-      <w:r>
-        <w:t xml:space="preserve"> de l'agence s'affichent; </w:t>
+        <w:t xml:space="preserve">lors les coordonnées de l'agence s'affichent; </w:t>
       </w:r>
     </w:p>
     <w:p>
@@ -1143,6 +850,7 @@
         </w:numPr>
       </w:pPr>
       <w:r>
+        <w:lastRenderedPageBreak/>
         <w:t xml:space="preserve">Lorsque l'utilisateur choisit un filtre, seuls les projets correspondant au </w:t>
       </w:r>
       <w:r>
@@ -1161,7 +869,6 @@
         </w:numPr>
       </w:pPr>
       <w:r>
-        <w:lastRenderedPageBreak/>
         <w:t xml:space="preserve">Lorsqu'aucun projet ne correspond au filtre choisi, un message clair doit l'indiquer </w:t>
       </w:r>
       <w:r>
@@ -1213,7 +920,6 @@
         <w:t xml:space="preserve"> identifiable visuellement par l'utilisateur.</w:t>
       </w:r>
     </w:p>
-    <w:p/>
     <w:p>
       <w:pPr>
         <w:rPr>
@@ -1252,19 +958,7 @@
         </w:numPr>
       </w:pPr>
       <w:r>
-        <w:t xml:space="preserve">Le site doit </w:t>
-      </w:r>
-      <w:r>
-        <w:t>présenter</w:t>
-      </w:r>
-      <w:r>
-        <w:t xml:space="preserve"> une mise en page claire et </w:t>
-      </w:r>
-      <w:r>
-        <w:t>cohérente</w:t>
-      </w:r>
-      <w:r>
-        <w:t xml:space="preserve"> d'une section a l'autre.</w:t>
+        <w:t>Le site doit présenter une mise en page claire et cohérente d'une section a l'autre.</w:t>
       </w:r>
     </w:p>
     <w:p>
@@ -1276,13 +970,7 @@
         </w:numPr>
       </w:pPr>
       <w:r>
-        <w:t xml:space="preserve">Le site doit garder une apparence visuelle </w:t>
-      </w:r>
-      <w:r>
-        <w:t>cohérente</w:t>
-      </w:r>
-      <w:r>
-        <w:t>, incluant les couleurs, les polices et l'espacement.</w:t>
+        <w:t>Le site doit garder une apparence visuelle cohérente, incluant les couleurs, les polices et l'espacement.</w:t>
       </w:r>
     </w:p>
     <w:p>
@@ -1294,31 +982,7 @@
         </w:numPr>
       </w:pPr>
       <w:r>
-        <w:t xml:space="preserve">Le site doit rester lisible et utilisable sur </w:t>
-      </w:r>
-      <w:r>
-        <w:t>différentes</w:t>
-      </w:r>
-      <w:r>
-        <w:t xml:space="preserve"> tailles d'</w:t>
-      </w:r>
-      <w:r>
-        <w:t>écran</w:t>
-      </w:r>
-      <w:r>
-        <w:t xml:space="preserve">, du </w:t>
-      </w:r>
-      <w:r>
-        <w:t>téléphone</w:t>
-      </w:r>
-      <w:r>
-        <w:t xml:space="preserve"> </w:t>
-      </w:r>
-      <w:r>
-        <w:t>à</w:t>
-      </w:r>
-      <w:r>
-        <w:t xml:space="preserve"> l'ordinateur.</w:t>
+        <w:t>Le site doit rester lisible et utilisable sur différentes tailles d'écran, du téléphone à l'ordinateur.</w:t>
       </w:r>
     </w:p>
     <w:p>
@@ -1330,35 +994,825 @@
         </w:numPr>
       </w:pPr>
       <w:r>
-        <w:t xml:space="preserve">Le site doit </w:t>
+        <w:t>Le site doit être simple à utiliser et avec un retour visuel immédiat aux actions de l'utilisateur.</w:t>
+      </w:r>
+    </w:p>
+    <w:p>
+      <w:pPr>
+        <w:pStyle w:val="Titre3"/>
+      </w:pPr>
+      <w:r>
+        <w:t xml:space="preserve">Étape </w:t>
+      </w:r>
+      <w:r>
+        <w:t>B</w:t>
+      </w:r>
+      <w:r>
+        <w:t xml:space="preserve">. </w:t>
+      </w:r>
+      <w:r>
+        <w:t>Arbre des composants (première version)</w:t>
+      </w:r>
+    </w:p>
+    <w:p>
+      <w:pPr>
+        <w:rPr>
+          <w:b/>
+          <w:bCs/>
+        </w:rPr>
+      </w:pPr>
+      <w:r>
+        <w:rPr>
+          <w:b/>
+          <w:bCs/>
+        </w:rPr>
+        <w:t>App</w:t>
+      </w:r>
+    </w:p>
+    <w:p>
+      <w:r>
+        <w:t>Responsabilité: contient le state principal de l'application (section active, liste des projets, filtre actif) et distribue les données aux enfants</w:t>
+      </w:r>
+    </w:p>
+    <w:p>
+      <w:pPr>
+        <w:rPr>
+          <w:b/>
+          <w:bCs/>
+        </w:rPr>
+      </w:pPr>
+      <w:proofErr w:type="spellStart"/>
+      <w:r>
+        <w:rPr>
+          <w:b/>
+          <w:bCs/>
+        </w:rPr>
+        <w:t>NavBar</w:t>
+      </w:r>
+      <w:proofErr w:type="spellEnd"/>
+    </w:p>
+    <w:p>
+      <w:r>
+        <w:t xml:space="preserve"> </w:t>
+      </w:r>
+      <w:r>
+        <w:t>Responsabilité</w:t>
+      </w:r>
+      <w:r>
+        <w:t>: afficher les liens de navigation entre les sections et indiquer visuellement la section active</w:t>
+      </w:r>
+      <w:r>
+        <w:t xml:space="preserve">. </w:t>
+      </w:r>
+      <w:r>
+        <w:t>Reçoit</w:t>
+      </w:r>
+      <w:r>
+        <w:t xml:space="preserve"> en </w:t>
+      </w:r>
+      <w:proofErr w:type="spellStart"/>
+      <w:r>
+        <w:t>props</w:t>
+      </w:r>
+      <w:proofErr w:type="spellEnd"/>
+      <w:r>
+        <w:t xml:space="preserve"> </w:t>
+      </w:r>
+      <w:r>
+        <w:t xml:space="preserve">la </w:t>
+      </w:r>
+      <w:r>
+        <w:t>section</w:t>
+      </w:r>
+      <w:r>
+        <w:t xml:space="preserve"> a</w:t>
+      </w:r>
+      <w:r>
+        <w:t xml:space="preserve">ctive, </w:t>
+      </w:r>
+      <w:r>
+        <w:t xml:space="preserve">et pour </w:t>
+      </w:r>
+      <w:r>
+        <w:t>changer</w:t>
+      </w:r>
+      <w:r>
+        <w:t xml:space="preserve"> la s</w:t>
+      </w:r>
+      <w:r>
+        <w:t>ection</w:t>
+      </w:r>
+    </w:p>
+    <w:p>
+      <w:pPr>
+        <w:rPr>
+          <w:b/>
+          <w:bCs/>
+        </w:rPr>
+      </w:pPr>
+      <w:r>
+        <w:rPr>
+          <w:b/>
+          <w:bCs/>
+        </w:rPr>
+        <w:t>Accueil</w:t>
+      </w:r>
+    </w:p>
+    <w:p>
+      <w:r>
+        <w:t>Responsabilité</w:t>
+      </w:r>
+      <w:r>
+        <w:t xml:space="preserve"> </w:t>
+      </w:r>
+      <w:r>
+        <w:t>présenter</w:t>
+      </w:r>
+      <w:r>
+        <w:t xml:space="preserve"> l'agence et donner une vue d'ensemble de ses </w:t>
+      </w:r>
+      <w:r>
+        <w:t xml:space="preserve">activités </w:t>
+      </w:r>
+      <w:r>
+        <w:t>affiche seulement quand section</w:t>
+      </w:r>
+      <w:r>
+        <w:t xml:space="preserve"> a</w:t>
+      </w:r>
+      <w:r>
+        <w:t>ctive vaut accueil</w:t>
+      </w:r>
+    </w:p>
+    <w:p>
+      <w:pPr>
+        <w:rPr>
+          <w:b/>
+          <w:bCs/>
+        </w:rPr>
+      </w:pPr>
+      <w:r>
+        <w:rPr>
+          <w:b/>
+          <w:bCs/>
+        </w:rPr>
+        <w:t>P</w:t>
+      </w:r>
+      <w:r>
+        <w:rPr>
+          <w:b/>
+          <w:bCs/>
+        </w:rPr>
+        <w:t>rojets</w:t>
+      </w:r>
+    </w:p>
+    <w:p>
+      <w:proofErr w:type="spellStart"/>
+      <w:r>
+        <w:t>R</w:t>
+      </w:r>
+      <w:r>
+        <w:t>esponsabilite</w:t>
+      </w:r>
+      <w:proofErr w:type="spellEnd"/>
+      <w:r>
+        <w:t xml:space="preserve">: </w:t>
+      </w:r>
+      <w:proofErr w:type="spellStart"/>
+      <w:r>
+        <w:t>gerer</w:t>
+      </w:r>
+      <w:proofErr w:type="spellEnd"/>
+      <w:r>
+        <w:t xml:space="preserve"> l'affichage de la liste des projets, le filtre actif et le retrait d'un projet </w:t>
+      </w:r>
+      <w:proofErr w:type="spellStart"/>
+      <w:r>
+        <w:t>recoit</w:t>
+      </w:r>
+      <w:proofErr w:type="spellEnd"/>
+      <w:r>
+        <w:t xml:space="preserve"> en </w:t>
+      </w:r>
+      <w:proofErr w:type="spellStart"/>
+      <w:r>
+        <w:t>props</w:t>
+      </w:r>
+      <w:proofErr w:type="spellEnd"/>
+      <w:r>
+        <w:t xml:space="preserve"> </w:t>
+      </w:r>
+      <w:r>
+        <w:t xml:space="preserve">la </w:t>
+      </w:r>
+      <w:r>
+        <w:t>liste</w:t>
+      </w:r>
+      <w:r>
+        <w:t xml:space="preserve"> des p</w:t>
+      </w:r>
+      <w:r>
+        <w:t>rojets</w:t>
+      </w:r>
+      <w:r>
+        <w:t>.</w:t>
+      </w:r>
+    </w:p>
+    <w:p>
+      <w:pPr>
+        <w:rPr>
+          <w:b/>
+          <w:bCs/>
+        </w:rPr>
+      </w:pPr>
+      <w:proofErr w:type="spellStart"/>
+      <w:r>
+        <w:rPr>
+          <w:b/>
+          <w:bCs/>
+        </w:rPr>
+        <w:t>FiltreProjets</w:t>
+      </w:r>
+      <w:proofErr w:type="spellEnd"/>
+    </w:p>
+    <w:p>
+      <w:proofErr w:type="spellStart"/>
+      <w:r>
+        <w:t>R</w:t>
+      </w:r>
+      <w:r>
+        <w:t>esponsabilite</w:t>
+      </w:r>
+      <w:proofErr w:type="spellEnd"/>
+      <w:r>
+        <w:t>: afficher les options de filtre et indiquer laquelle est activ</w:t>
+      </w:r>
+      <w:r>
+        <w:t xml:space="preserve">e. </w:t>
+      </w:r>
+      <w:proofErr w:type="spellStart"/>
+      <w:r>
+        <w:t>R</w:t>
+      </w:r>
+      <w:r>
+        <w:t>ecoit</w:t>
+      </w:r>
+      <w:proofErr w:type="spellEnd"/>
+      <w:r>
+        <w:t xml:space="preserve"> en </w:t>
+      </w:r>
+      <w:proofErr w:type="spellStart"/>
+      <w:r>
+        <w:t>props</w:t>
+      </w:r>
+      <w:proofErr w:type="spellEnd"/>
+      <w:r>
+        <w:t xml:space="preserve"> </w:t>
+      </w:r>
+      <w:r>
+        <w:t>le filtre</w:t>
+      </w:r>
+      <w:r>
+        <w:t xml:space="preserve"> a</w:t>
+      </w:r>
+      <w:r>
+        <w:t>ctif</w:t>
+      </w:r>
+      <w:r>
+        <w:t xml:space="preserve"> et pour</w:t>
+      </w:r>
+      <w:r>
+        <w:t xml:space="preserve"> changer</w:t>
+      </w:r>
+      <w:r>
+        <w:t xml:space="preserve"> le f</w:t>
+      </w:r>
+      <w:r>
+        <w:t>iltre</w:t>
+      </w:r>
+    </w:p>
+    <w:p>
+      <w:pPr>
+        <w:rPr>
+          <w:b/>
+          <w:bCs/>
+        </w:rPr>
+      </w:pPr>
+      <w:proofErr w:type="spellStart"/>
+      <w:r>
+        <w:rPr>
+          <w:b/>
+          <w:bCs/>
+        </w:rPr>
+        <w:t>ListeProjets</w:t>
+      </w:r>
+      <w:proofErr w:type="spellEnd"/>
+    </w:p>
+    <w:p>
+      <w:r>
+        <w:t>Responsabilité</w:t>
+      </w:r>
+      <w:r>
+        <w:t xml:space="preserve">: transformer la liste </w:t>
+      </w:r>
+      <w:r>
+        <w:t>filtrée</w:t>
+      </w:r>
+      <w:r>
+        <w:t xml:space="preserve"> de projets en une </w:t>
+      </w:r>
+      <w:r>
+        <w:t>série</w:t>
+      </w:r>
+      <w:r>
+        <w:t xml:space="preserve"> de cartes, ou afficher un message si la liste est vide </w:t>
+      </w:r>
+      <w:proofErr w:type="spellStart"/>
+      <w:r>
+        <w:t>recoit</w:t>
+      </w:r>
+      <w:proofErr w:type="spellEnd"/>
+      <w:r>
+        <w:t xml:space="preserve"> en </w:t>
+      </w:r>
+      <w:proofErr w:type="spellStart"/>
+      <w:r>
+        <w:t>props</w:t>
+      </w:r>
+      <w:proofErr w:type="spellEnd"/>
+      <w:r>
+        <w:t xml:space="preserve"> les </w:t>
+      </w:r>
+      <w:r>
+        <w:t>projets</w:t>
+      </w:r>
+      <w:r>
+        <w:t xml:space="preserve"> a</w:t>
+      </w:r>
+      <w:r>
+        <w:t>ffiches</w:t>
+      </w:r>
+      <w:r>
+        <w:t xml:space="preserve"> et pour</w:t>
+      </w:r>
+      <w:r>
+        <w:t xml:space="preserve"> retirer</w:t>
+      </w:r>
+      <w:r>
+        <w:t xml:space="preserve"> p</w:t>
+      </w:r>
+      <w:r>
+        <w:t>rojet</w:t>
+      </w:r>
+    </w:p>
+    <w:p>
+      <w:proofErr w:type="spellStart"/>
+      <w:r>
+        <w:rPr>
+          <w:b/>
+          <w:bCs/>
+        </w:rPr>
+        <w:t>ProjetCard</w:t>
+      </w:r>
+      <w:proofErr w:type="spellEnd"/>
+      <w:r>
+        <w:t xml:space="preserve"> </w:t>
+      </w:r>
+    </w:p>
+    <w:p>
+      <w:r>
+        <w:lastRenderedPageBreak/>
+        <w:t>Responsabilité</w:t>
+      </w:r>
+      <w:r>
+        <w:t xml:space="preserve">: afficher les informations d'un seul projet et </w:t>
+      </w:r>
+      <w:r>
+        <w:t>déclencher</w:t>
+      </w:r>
+      <w:r>
+        <w:t xml:space="preserve"> son retrait</w:t>
+      </w:r>
+      <w:r>
+        <w:t xml:space="preserve"> </w:t>
+      </w:r>
+      <w:proofErr w:type="spellStart"/>
+      <w:r>
+        <w:t>recoit</w:t>
+      </w:r>
+      <w:proofErr w:type="spellEnd"/>
+      <w:r>
+        <w:t xml:space="preserve"> en </w:t>
+      </w:r>
+      <w:proofErr w:type="spellStart"/>
+      <w:r>
+        <w:t>props</w:t>
+      </w:r>
+      <w:proofErr w:type="spellEnd"/>
+      <w:r>
+        <w:t xml:space="preserve"> le </w:t>
+      </w:r>
+      <w:r>
+        <w:t xml:space="preserve">projet, </w:t>
+      </w:r>
+      <w:r>
+        <w:t>et l’option pour r</w:t>
+      </w:r>
+      <w:r>
+        <w:t>etirer</w:t>
+      </w:r>
+    </w:p>
+    <w:p>
+      <w:pPr>
+        <w:rPr>
+          <w:b/>
+          <w:bCs/>
+        </w:rPr>
+      </w:pPr>
+      <w:r>
+        <w:rPr>
+          <w:b/>
+          <w:bCs/>
+        </w:rPr>
+        <w:t>Services</w:t>
+      </w:r>
+    </w:p>
+    <w:p>
+      <w:r>
+        <w:t>Responsabilité</w:t>
+      </w:r>
+      <w:r>
+        <w:t xml:space="preserve">: </w:t>
+      </w:r>
+      <w:r>
+        <w:t>présenter</w:t>
+      </w:r>
+      <w:r>
+        <w:t xml:space="preserve"> les services offerts par l'agence</w:t>
+      </w:r>
+      <w:r>
+        <w:t xml:space="preserve"> </w:t>
+      </w:r>
+      <w:r>
+        <w:t xml:space="preserve">affiche seulement quand </w:t>
+      </w:r>
+      <w:r>
+        <w:t>la section active</w:t>
+      </w:r>
+      <w:r>
+        <w:t xml:space="preserve"> vaut services</w:t>
+      </w:r>
+    </w:p>
+    <w:p>
+      <w:pPr>
+        <w:rPr>
+          <w:b/>
+          <w:bCs/>
+        </w:rPr>
+      </w:pPr>
+      <w:proofErr w:type="spellStart"/>
+      <w:r>
+        <w:rPr>
+          <w:b/>
+          <w:bCs/>
+        </w:rPr>
+        <w:t>APropos</w:t>
+      </w:r>
+      <w:proofErr w:type="spellEnd"/>
+    </w:p>
+    <w:p>
+      <w:r>
+        <w:t>Responsabilité</w:t>
+      </w:r>
+      <w:r>
+        <w:t xml:space="preserve">: </w:t>
+      </w:r>
+      <w:r>
+        <w:t>présenter</w:t>
+      </w:r>
+      <w:r>
+        <w:t xml:space="preserve"> l'historique ou la mission de l'agence</w:t>
+      </w:r>
+      <w:r>
+        <w:t xml:space="preserve"> </w:t>
+      </w:r>
+      <w:r>
+        <w:t xml:space="preserve">affiche seulement quand </w:t>
+      </w:r>
+      <w:r>
+        <w:t xml:space="preserve">la </w:t>
+      </w:r>
+      <w:r>
+        <w:t>section</w:t>
+      </w:r>
+      <w:r>
+        <w:t xml:space="preserve"> a</w:t>
+      </w:r>
+      <w:r>
+        <w:t xml:space="preserve">ctive </w:t>
+      </w:r>
+      <w:r>
+        <w:t>est</w:t>
+      </w:r>
+      <w:r>
+        <w:t xml:space="preserve"> </w:t>
+      </w:r>
+      <w:proofErr w:type="spellStart"/>
+      <w:r>
+        <w:t>AP</w:t>
+      </w:r>
+      <w:r>
+        <w:t>ropos</w:t>
+      </w:r>
+      <w:proofErr w:type="spellEnd"/>
+    </w:p>
+    <w:p>
+      <w:pPr>
+        <w:rPr>
+          <w:b/>
+          <w:bCs/>
+        </w:rPr>
+      </w:pPr>
+      <w:proofErr w:type="spellStart"/>
+      <w:r>
+        <w:rPr>
+          <w:b/>
+          <w:bCs/>
+        </w:rPr>
+        <w:t>NousJoindre</w:t>
+      </w:r>
+      <w:proofErr w:type="spellEnd"/>
+      <w:r>
+        <w:rPr>
+          <w:b/>
+          <w:bCs/>
+        </w:rPr>
+        <w:t xml:space="preserve"> </w:t>
+      </w:r>
+    </w:p>
+    <w:p>
+      <w:r>
+        <w:t>Responsabilité</w:t>
+      </w:r>
+      <w:r>
+        <w:t xml:space="preserve">: </w:t>
+      </w:r>
+      <w:r>
+        <w:t>présenter</w:t>
+      </w:r>
+      <w:r>
+        <w:t xml:space="preserve"> les </w:t>
+      </w:r>
+      <w:r>
+        <w:t>coordonnées</w:t>
+      </w:r>
+      <w:r>
+        <w:t xml:space="preserve"> et un moyen de contacter l'agence</w:t>
+      </w:r>
+      <w:r>
+        <w:t>.</w:t>
+      </w:r>
+    </w:p>
+    <w:p>
+      <w:pPr>
+        <w:rPr>
+          <w:b/>
+          <w:bCs/>
+        </w:rPr>
+      </w:pPr>
+      <w:r>
+        <w:t xml:space="preserve"> </w:t>
+      </w:r>
+      <w:r>
+        <w:rPr>
+          <w:b/>
+          <w:bCs/>
+        </w:rPr>
+        <w:t>F</w:t>
+      </w:r>
+      <w:r>
+        <w:rPr>
+          <w:b/>
+          <w:bCs/>
+        </w:rPr>
+        <w:t>ooter</w:t>
+      </w:r>
+    </w:p>
+    <w:p>
+      <w:proofErr w:type="spellStart"/>
+      <w:r>
+        <w:t>R</w:t>
+      </w:r>
+      <w:r>
+        <w:t>esponsabilite</w:t>
+      </w:r>
+      <w:proofErr w:type="spellEnd"/>
+      <w:r>
+        <w:t xml:space="preserve">: afficher les informations de bas de page, communes </w:t>
+      </w:r>
+      <w:r>
+        <w:t>à</w:t>
+      </w:r>
+      <w:r>
+        <w:t xml:space="preserve"> toutes les sections</w:t>
+      </w:r>
+    </w:p>
+    <w:p>
+      <w:pPr>
+        <w:rPr>
+          <w:b/>
+          <w:bCs/>
+          <w:sz w:val="24"/>
+          <w:szCs w:val="24"/>
+        </w:rPr>
+      </w:pPr>
+      <w:proofErr w:type="spellStart"/>
+      <w:r>
+        <w:rPr>
+          <w:b/>
+          <w:bCs/>
+          <w:sz w:val="24"/>
+          <w:szCs w:val="24"/>
+        </w:rPr>
+        <w:t>Elements</w:t>
+      </w:r>
+      <w:proofErr w:type="spellEnd"/>
+      <w:r>
+        <w:rPr>
+          <w:b/>
+          <w:bCs/>
+          <w:sz w:val="24"/>
+          <w:szCs w:val="24"/>
+        </w:rPr>
+        <w:t xml:space="preserve"> </w:t>
+      </w:r>
+      <w:r>
+        <w:rPr>
+          <w:b/>
+          <w:bCs/>
+          <w:sz w:val="24"/>
+          <w:szCs w:val="24"/>
+        </w:rPr>
+        <w:t>réutilisables</w:t>
+      </w:r>
+      <w:r>
+        <w:rPr>
+          <w:b/>
+          <w:bCs/>
+          <w:sz w:val="24"/>
+          <w:szCs w:val="24"/>
+        </w:rPr>
+        <w:t xml:space="preserve"> identifies</w:t>
+      </w:r>
+    </w:p>
+    <w:p>
+      <w:pPr>
+        <w:pStyle w:val="Paragraphedeliste"/>
+        <w:numPr>
+          <w:ilvl w:val="0"/>
+          <w:numId w:val="4"/>
+        </w:numPr>
+      </w:pPr>
+      <w:proofErr w:type="spellStart"/>
+      <w:r>
+        <w:t>ProjetCard</w:t>
+      </w:r>
+      <w:proofErr w:type="spellEnd"/>
+    </w:p>
+    <w:p>
+      <w:pPr>
+        <w:pStyle w:val="Paragraphedeliste"/>
+        <w:numPr>
+          <w:ilvl w:val="0"/>
+          <w:numId w:val="4"/>
+        </w:numPr>
+      </w:pPr>
+      <w:proofErr w:type="spellStart"/>
+      <w:r>
+        <w:t>NavBar</w:t>
+      </w:r>
+      <w:proofErr w:type="spellEnd"/>
+      <w:r>
+        <w:t xml:space="preserve"> </w:t>
+      </w:r>
+    </w:p>
+    <w:p>
+      <w:pPr>
+        <w:rPr>
+          <w:b/>
+          <w:bCs/>
+        </w:rPr>
+      </w:pPr>
+      <w:r>
+        <w:rPr>
+          <w:b/>
+          <w:bCs/>
+        </w:rPr>
+        <w:t>Évolution</w:t>
+      </w:r>
+      <w:r>
+        <w:rPr>
+          <w:b/>
+          <w:bCs/>
+        </w:rPr>
+        <w:t xml:space="preserve"> </w:t>
+      </w:r>
+      <w:r>
+        <w:rPr>
+          <w:b/>
+          <w:bCs/>
+        </w:rPr>
+        <w:t>prévue</w:t>
+      </w:r>
+    </w:p>
+    <w:p>
+      <w:r>
+        <w:t xml:space="preserve">L'arbre pourra changer une fois le code de </w:t>
+      </w:r>
+      <w:r>
+        <w:t>départ</w:t>
+      </w:r>
+      <w:r>
+        <w:t xml:space="preserve"> explore, par exemple</w:t>
+      </w:r>
+      <w:r>
+        <w:t xml:space="preserve"> </w:t>
+      </w:r>
+      <w:r>
+        <w:t xml:space="preserve">si une section </w:t>
+      </w:r>
+      <w:r>
+        <w:t>mérite</w:t>
+      </w:r>
+      <w:r>
+        <w:t xml:space="preserve"> d'</w:t>
       </w:r>
       <w:r>
         <w:t>être</w:t>
       </w:r>
       <w:r>
-        <w:t xml:space="preserve"> simple </w:t>
-      </w:r>
-      <w:r>
-        <w:t>à</w:t>
-      </w:r>
-      <w:r>
-        <w:t xml:space="preserve"> utiliser et</w:t>
-      </w:r>
-      <w:r>
-        <w:t xml:space="preserve"> avec</w:t>
-      </w:r>
-      <w:r>
-        <w:t xml:space="preserve"> un retour visuel </w:t>
-      </w:r>
-      <w:r>
-        <w:t>immédiat</w:t>
-      </w:r>
-      <w:r>
-        <w:t xml:space="preserve"> aux actions de l'utilisateur.</w:t>
-      </w:r>
-    </w:p>
-    <w:p/>
-    <w:p/>
+        <w:t xml:space="preserve"> </w:t>
+      </w:r>
+      <w:r>
+        <w:t>divisée</w:t>
+      </w:r>
+      <w:r>
+        <w:t xml:space="preserve"> davantage</w:t>
+      </w:r>
+      <w:r>
+        <w:t>.</w:t>
+      </w:r>
+    </w:p>
+    <w:p>
+      <w:pPr>
+        <w:pStyle w:val="Titre3"/>
+      </w:pPr>
+      <w:r>
+        <w:t xml:space="preserve">Étape </w:t>
+      </w:r>
+      <w:r>
+        <w:t>C</w:t>
+      </w:r>
+      <w:r>
+        <w:t> :</w:t>
+      </w:r>
+      <w:r>
+        <w:t xml:space="preserve"> </w:t>
+      </w:r>
+      <w:r>
+        <w:t>L</w:t>
+      </w:r>
+      <w:r>
+        <w:t>e code de départ</w:t>
+      </w:r>
+      <w:r>
+        <w:t>.</w:t>
+      </w:r>
+    </w:p>
+    <w:p>
+      <w:pPr>
+        <w:pStyle w:val="Paragraphedeliste"/>
+        <w:numPr>
+          <w:ilvl w:val="0"/>
+          <w:numId w:val="5"/>
+        </w:numPr>
+      </w:pPr>
+      <w:r>
+        <w:t>Ménage initiale</w:t>
+      </w:r>
+    </w:p>
+    <w:p>
+      <w:pPr>
+        <w:pStyle w:val="Paragraphedeliste"/>
+        <w:numPr>
+          <w:ilvl w:val="0"/>
+          <w:numId w:val="5"/>
+        </w:numPr>
+      </w:pPr>
+      <w:r>
+        <w:t xml:space="preserve">Erreurs remarques : </w:t>
+      </w:r>
+    </w:p>
     <w:sectPr>
       <w:pgSz w:w="12240" w:h="15840"/>
       <w:pgMar w:top="1417" w:right="1417" w:bottom="1417" w:left="1417" w:header="708" w:footer="708" w:gutter="0"/>
@@ -1372,6 +1826,119 @@
 <file path=word/numbering.xml><?xml version="1.0" encoding="utf-8"?>
 <w:numbering xmlns:wpc="http://schemas.microsoft.com/office/word/2010/wordprocessingCanvas" xmlns:cx="http://schemas.microsoft.com/office/drawing/2014/chartex" xmlns:cx1="http://schemas.microsoft.com/office/drawing/2015/9/8/chartex" xmlns:cx2="http://schemas.microsoft.com/office/drawing/2015/10/21/chartex" xmlns:cx3="http://schemas.microsoft.com/office/drawing/2016/5/9/chartex" xmlns:cx4="http://schemas.microsoft.com/office/drawing/2016/5/10/chartex" xmlns:cx5="http://schemas.microsoft.com/office/drawing/2016/5/11/chartex" xmlns:cx6="http://schemas.microsoft.com/office/drawing/2016/5/12/chartex" xmlns:cx7="http://schemas.microsoft.com/office/drawing/2016/5/13/chartex" xmlns:cx8="http://schemas.microsoft.com/office/drawing/2016/5/14/chartex" xmlns:mc="http://schemas.openxmlformats.org/markup-compatibility/2006" xmlns:aink="http://schemas.microsoft.com/office/drawing/2016/ink" xmlns:am3d="http://schemas.microsoft.com/office/drawing/2017/model3d" xmlns:o="urn:schemas-microsoft-com:office:office" xmlns:oel="http://schemas.microsoft.com/office/2019/extlst" xmlns:r="http://schemas.openxmlformats.org/officeDocument/2006/relationships" xmlns:m="http://schemas.openxmlformats.org/officeDocument/2006/math" xmlns:v="urn:schemas-microsoft-com:vml" xmlns:wp14="http://schemas.microsoft.com/office/word/2010/wordprocessingDrawing" xmlns:wp="http://schemas.openxmlformats.org/drawingml/2006/wordprocessingDrawing" xmlns:w10="urn:schemas-microsoft-com:office:word" xmlns:w="http://schemas.openxmlformats.org/wordprocessingml/2006/main" xmlns:w14="http://schemas.microsoft.com/office/word/2010/wordml" xmlns:w15="http://schemas.microsoft.com/office/word/2012/wordml" xmlns:w16cex="http://schemas.microsoft.com/office/word/2018/wordml/cex" xmlns:w16cid="http://schemas.microsoft.com/office/word/2016/wordml/cid" xmlns:w16="http://schemas.microsoft.com/office/word/2018/wordml" xmlns:w16du="http://schemas.microsoft.com/office/word/2023/wordml/word16du" xmlns:w16sdtdh="http://schemas.microsoft.com/office/word/2020/wordml/sdtdatahash" xmlns:w16sdtfl="http://schemas.microsoft.com/office/word/2024/wordml/sdtformatlock" xmlns:w16se="http://schemas.microsoft.com/office/word/2015/wordml/symex" xmlns:wpg="http://schemas.microsoft.com/office/word/2010/wordprocessingGroup" xmlns:wpi="http://schemas.microsoft.com/office/word/2010/wordprocessingInk" xmlns:wne="http://schemas.microsoft.com/office/word/2006/wordml" xmlns:wps="http://schemas.microsoft.com/office/word/2010/wordprocessingShape" mc:Ignorable="w14 w15 w16se w16cid w16 w16cex w16sdtdh w16sdtfl w16du wp14">
   <w:abstractNum w:abstractNumId="0" w15:restartNumberingAfterBreak="0">
+    <w:nsid w:val="2DA726E4"/>
+    <w:multiLevelType w:val="hybridMultilevel"/>
+    <w:tmpl w:val="4E1603DE"/>
+    <w:lvl w:ilvl="0" w:tplc="0C0C0001">
+      <w:start w:val="1"/>
+      <w:numFmt w:val="bullet"/>
+      <w:lvlText w:val=""/>
+      <w:lvlJc w:val="left"/>
+      <w:pPr>
+        <w:ind w:left="720" w:hanging="360"/>
+      </w:pPr>
+      <w:rPr>
+        <w:rFonts w:ascii="Symbol" w:hAnsi="Symbol" w:hint="default"/>
+      </w:rPr>
+    </w:lvl>
+    <w:lvl w:ilvl="1" w:tplc="0C0C0003" w:tentative="1">
+      <w:start w:val="1"/>
+      <w:numFmt w:val="bullet"/>
+      <w:lvlText w:val="o"/>
+      <w:lvlJc w:val="left"/>
+      <w:pPr>
+        <w:ind w:left="1440" w:hanging="360"/>
+      </w:pPr>
+      <w:rPr>
+        <w:rFonts w:ascii="Courier New" w:hAnsi="Courier New" w:cs="Courier New" w:hint="default"/>
+      </w:rPr>
+    </w:lvl>
+    <w:lvl w:ilvl="2" w:tplc="0C0C0005" w:tentative="1">
+      <w:start w:val="1"/>
+      <w:numFmt w:val="bullet"/>
+      <w:lvlText w:val=""/>
+      <w:lvlJc w:val="left"/>
+      <w:pPr>
+        <w:ind w:left="2160" w:hanging="360"/>
+      </w:pPr>
+      <w:rPr>
+        <w:rFonts w:ascii="Wingdings" w:hAnsi="Wingdings" w:hint="default"/>
+      </w:rPr>
+    </w:lvl>
+    <w:lvl w:ilvl="3" w:tplc="0C0C0001" w:tentative="1">
+      <w:start w:val="1"/>
+      <w:numFmt w:val="bullet"/>
+      <w:lvlText w:val=""/>
+      <w:lvlJc w:val="left"/>
+      <w:pPr>
+        <w:ind w:left="2880" w:hanging="360"/>
+      </w:pPr>
+      <w:rPr>
+        <w:rFonts w:ascii="Symbol" w:hAnsi="Symbol" w:hint="default"/>
+      </w:rPr>
+    </w:lvl>
+    <w:lvl w:ilvl="4" w:tplc="0C0C0003" w:tentative="1">
+      <w:start w:val="1"/>
+      <w:numFmt w:val="bullet"/>
+      <w:lvlText w:val="o"/>
+      <w:lvlJc w:val="left"/>
+      <w:pPr>
+        <w:ind w:left="3600" w:hanging="360"/>
+      </w:pPr>
+      <w:rPr>
+        <w:rFonts w:ascii="Courier New" w:hAnsi="Courier New" w:cs="Courier New" w:hint="default"/>
+      </w:rPr>
+    </w:lvl>
+    <w:lvl w:ilvl="5" w:tplc="0C0C0005" w:tentative="1">
+      <w:start w:val="1"/>
+      <w:numFmt w:val="bullet"/>
+      <w:lvlText w:val=""/>
+      <w:lvlJc w:val="left"/>
+      <w:pPr>
+        <w:ind w:left="4320" w:hanging="360"/>
+      </w:pPr>
+      <w:rPr>
+        <w:rFonts w:ascii="Wingdings" w:hAnsi="Wingdings" w:hint="default"/>
+      </w:rPr>
+    </w:lvl>
+    <w:lvl w:ilvl="6" w:tplc="0C0C0001" w:tentative="1">
+      <w:start w:val="1"/>
+      <w:numFmt w:val="bullet"/>
+      <w:lvlText w:val=""/>
+      <w:lvlJc w:val="left"/>
+      <w:pPr>
+        <w:ind w:left="5040" w:hanging="360"/>
+      </w:pPr>
+      <w:rPr>
+        <w:rFonts w:ascii="Symbol" w:hAnsi="Symbol" w:hint="default"/>
+      </w:rPr>
+    </w:lvl>
+    <w:lvl w:ilvl="7" w:tplc="0C0C0003" w:tentative="1">
+      <w:start w:val="1"/>
+      <w:numFmt w:val="bullet"/>
+      <w:lvlText w:val="o"/>
+      <w:lvlJc w:val="left"/>
+      <w:pPr>
+        <w:ind w:left="5760" w:hanging="360"/>
+      </w:pPr>
+      <w:rPr>
+        <w:rFonts w:ascii="Courier New" w:hAnsi="Courier New" w:cs="Courier New" w:hint="default"/>
+      </w:rPr>
+    </w:lvl>
+    <w:lvl w:ilvl="8" w:tplc="0C0C0005" w:tentative="1">
+      <w:start w:val="1"/>
+      <w:numFmt w:val="bullet"/>
+      <w:lvlText w:val=""/>
+      <w:lvlJc w:val="left"/>
+      <w:pPr>
+        <w:ind w:left="6480" w:hanging="360"/>
+      </w:pPr>
+      <w:rPr>
+        <w:rFonts w:ascii="Wingdings" w:hAnsi="Wingdings" w:hint="default"/>
+      </w:rPr>
+    </w:lvl>
+  </w:abstractNum>
+  <w:abstractNum w:abstractNumId="1" w15:restartNumberingAfterBreak="0">
     <w:nsid w:val="48FF2865"/>
     <w:multiLevelType w:val="hybridMultilevel"/>
     <w:tmpl w:val="A4526698"/>
@@ -1484,7 +2051,7 @@
       </w:rPr>
     </w:lvl>
   </w:abstractNum>
-  <w:abstractNum w:abstractNumId="1" w15:restartNumberingAfterBreak="0">
+  <w:abstractNum w:abstractNumId="2" w15:restartNumberingAfterBreak="0">
     <w:nsid w:val="4CA33F7B"/>
     <w:multiLevelType w:val="hybridMultilevel"/>
     <w:tmpl w:val="5DD2A532"/>
@@ -1597,7 +2164,120 @@
       </w:rPr>
     </w:lvl>
   </w:abstractNum>
-  <w:abstractNum w:abstractNumId="2" w15:restartNumberingAfterBreak="0">
+  <w:abstractNum w:abstractNumId="3" w15:restartNumberingAfterBreak="0">
+    <w:nsid w:val="508B17E0"/>
+    <w:multiLevelType w:val="hybridMultilevel"/>
+    <w:tmpl w:val="697ACF8E"/>
+    <w:lvl w:ilvl="0" w:tplc="0C0C0001">
+      <w:start w:val="1"/>
+      <w:numFmt w:val="bullet"/>
+      <w:lvlText w:val=""/>
+      <w:lvlJc w:val="left"/>
+      <w:pPr>
+        <w:ind w:left="720" w:hanging="360"/>
+      </w:pPr>
+      <w:rPr>
+        <w:rFonts w:ascii="Symbol" w:hAnsi="Symbol" w:hint="default"/>
+      </w:rPr>
+    </w:lvl>
+    <w:lvl w:ilvl="1" w:tplc="0C0C0003" w:tentative="1">
+      <w:start w:val="1"/>
+      <w:numFmt w:val="bullet"/>
+      <w:lvlText w:val="o"/>
+      <w:lvlJc w:val="left"/>
+      <w:pPr>
+        <w:ind w:left="1440" w:hanging="360"/>
+      </w:pPr>
+      <w:rPr>
+        <w:rFonts w:ascii="Courier New" w:hAnsi="Courier New" w:cs="Courier New" w:hint="default"/>
+      </w:rPr>
+    </w:lvl>
+    <w:lvl w:ilvl="2" w:tplc="0C0C0005" w:tentative="1">
+      <w:start w:val="1"/>
+      <w:numFmt w:val="bullet"/>
+      <w:lvlText w:val=""/>
+      <w:lvlJc w:val="left"/>
+      <w:pPr>
+        <w:ind w:left="2160" w:hanging="360"/>
+      </w:pPr>
+      <w:rPr>
+        <w:rFonts w:ascii="Wingdings" w:hAnsi="Wingdings" w:hint="default"/>
+      </w:rPr>
+    </w:lvl>
+    <w:lvl w:ilvl="3" w:tplc="0C0C0001" w:tentative="1">
+      <w:start w:val="1"/>
+      <w:numFmt w:val="bullet"/>
+      <w:lvlText w:val=""/>
+      <w:lvlJc w:val="left"/>
+      <w:pPr>
+        <w:ind w:left="2880" w:hanging="360"/>
+      </w:pPr>
+      <w:rPr>
+        <w:rFonts w:ascii="Symbol" w:hAnsi="Symbol" w:hint="default"/>
+      </w:rPr>
+    </w:lvl>
+    <w:lvl w:ilvl="4" w:tplc="0C0C0003" w:tentative="1">
+      <w:start w:val="1"/>
+      <w:numFmt w:val="bullet"/>
+      <w:lvlText w:val="o"/>
+      <w:lvlJc w:val="left"/>
+      <w:pPr>
+        <w:ind w:left="3600" w:hanging="360"/>
+      </w:pPr>
+      <w:rPr>
+        <w:rFonts w:ascii="Courier New" w:hAnsi="Courier New" w:cs="Courier New" w:hint="default"/>
+      </w:rPr>
+    </w:lvl>
+    <w:lvl w:ilvl="5" w:tplc="0C0C0005" w:tentative="1">
+      <w:start w:val="1"/>
+      <w:numFmt w:val="bullet"/>
+      <w:lvlText w:val=""/>
+      <w:lvlJc w:val="left"/>
+      <w:pPr>
+        <w:ind w:left="4320" w:hanging="360"/>
+      </w:pPr>
+      <w:rPr>
+        <w:rFonts w:ascii="Wingdings" w:hAnsi="Wingdings" w:hint="default"/>
+      </w:rPr>
+    </w:lvl>
+    <w:lvl w:ilvl="6" w:tplc="0C0C0001" w:tentative="1">
+      <w:start w:val="1"/>
+      <w:numFmt w:val="bullet"/>
+      <w:lvlText w:val=""/>
+      <w:lvlJc w:val="left"/>
+      <w:pPr>
+        <w:ind w:left="5040" w:hanging="360"/>
+      </w:pPr>
+      <w:rPr>
+        <w:rFonts w:ascii="Symbol" w:hAnsi="Symbol" w:hint="default"/>
+      </w:rPr>
+    </w:lvl>
+    <w:lvl w:ilvl="7" w:tplc="0C0C0003" w:tentative="1">
+      <w:start w:val="1"/>
+      <w:numFmt w:val="bullet"/>
+      <w:lvlText w:val="o"/>
+      <w:lvlJc w:val="left"/>
+      <w:pPr>
+        <w:ind w:left="5760" w:hanging="360"/>
+      </w:pPr>
+      <w:rPr>
+        <w:rFonts w:ascii="Courier New" w:hAnsi="Courier New" w:cs="Courier New" w:hint="default"/>
+      </w:rPr>
+    </w:lvl>
+    <w:lvl w:ilvl="8" w:tplc="0C0C0005" w:tentative="1">
+      <w:start w:val="1"/>
+      <w:numFmt w:val="bullet"/>
+      <w:lvlText w:val=""/>
+      <w:lvlJc w:val="left"/>
+      <w:pPr>
+        <w:ind w:left="6480" w:hanging="360"/>
+      </w:pPr>
+      <w:rPr>
+        <w:rFonts w:ascii="Wingdings" w:hAnsi="Wingdings" w:hint="default"/>
+      </w:rPr>
+    </w:lvl>
+  </w:abstractNum>
+  <w:abstractNum w:abstractNumId="4" w15:restartNumberingAfterBreak="0">
     <w:nsid w:val="75D3749B"/>
     <w:multiLevelType w:val="hybridMultilevel"/>
     <w:tmpl w:val="82F8E244"/>
@@ -1711,13 +2391,19 @@
     </w:lvl>
   </w:abstractNum>
   <w:num w:numId="1" w16cid:durableId="8799778">
+    <w:abstractNumId w:val="2"/>
+  </w:num>
+  <w:num w:numId="2" w16cid:durableId="1255479645">
     <w:abstractNumId w:val="1"/>
   </w:num>
-  <w:num w:numId="2" w16cid:durableId="1255479645">
+  <w:num w:numId="3" w16cid:durableId="1411730032">
+    <w:abstractNumId w:val="4"/>
+  </w:num>
+  <w:num w:numId="4" w16cid:durableId="633170729">
+    <w:abstractNumId w:val="3"/>
+  </w:num>
+  <w:num w:numId="5" w16cid:durableId="1636981620">
     <w:abstractNumId w:val="0"/>
-  </w:num>
-  <w:num w:numId="3" w16cid:durableId="1411730032">
-    <w:abstractNumId w:val="2"/>
   </w:num>
 </w:numbering>
 </file>
@@ -2121,7 +2807,7 @@
   <w:style w:type="paragraph" w:default="1" w:styleId="Normal">
     <w:name w:val="Normal"/>
     <w:qFormat/>
-    <w:rsid w:val="00B06F8B"/>
+    <w:rsid w:val="00801D9E"/>
   </w:style>
   <w:style w:type="paragraph" w:styleId="Titre1">
     <w:name w:val="heading 1"/>

</xml_diff>

<commit_message>
partie 1 etape C: corrections d'erreurs dans le code + documentation (.docx)
</commit_message>
<xml_diff>
--- a/Tp1-prog-avancee-partie1.docx
+++ b/Tp1-prog-avancee-partie1.docx
@@ -123,15 +123,7 @@
     </w:p>
     <w:p>
       <w:r>
-        <w:t xml:space="preserve">Déclencheur : l'utilisateur clique sur un lien de section dans la </w:t>
-      </w:r>
-      <w:proofErr w:type="spellStart"/>
-      <w:r>
-        <w:t>NavBar</w:t>
-      </w:r>
-      <w:proofErr w:type="spellEnd"/>
-      <w:r>
-        <w:t xml:space="preserve"> (Accueil, Projets, Services, À propos, Nous</w:t>
+        <w:t>Déclencheur : l'utilisateur clique sur un lien de section dans la NavBar (Accueil, Projets, Services, À propos, Nous</w:t>
       </w:r>
       <w:r>
         <w:t xml:space="preserve"> </w:t>
@@ -580,15 +572,7 @@
         <w:t>Alors</w:t>
       </w:r>
       <w:r>
-        <w:t xml:space="preserve"> une nouvelle liste sans ce projet est créée avec </w:t>
-      </w:r>
-      <w:proofErr w:type="gramStart"/>
-      <w:r>
-        <w:t>filtre(</w:t>
-      </w:r>
-      <w:proofErr w:type="gramEnd"/>
-      <w:r>
-        <w:t xml:space="preserve">) et </w:t>
+        <w:t xml:space="preserve"> une nouvelle liste sans ce projet est créée avec filtre() et </w:t>
       </w:r>
       <w:r>
         <w:t>remplace le</w:t>
@@ -1005,357 +989,277 @@
         <w:t xml:space="preserve">Étape </w:t>
       </w:r>
       <w:r>
-        <w:t>B</w:t>
+        <w:t xml:space="preserve">B. </w:t>
+      </w:r>
+      <w:r>
+        <w:t>Arbre des composants (première version)</w:t>
+      </w:r>
+    </w:p>
+    <w:p>
+      <w:pPr>
+        <w:rPr>
+          <w:b/>
+          <w:bCs/>
+        </w:rPr>
+      </w:pPr>
+      <w:r>
+        <w:rPr>
+          <w:b/>
+          <w:bCs/>
+        </w:rPr>
+        <w:t>App</w:t>
+      </w:r>
+    </w:p>
+    <w:p>
+      <w:r>
+        <w:t>Responsabilité: contient le state principal de l'application (section active, liste des projets, filtre actif) et distribue les données aux enfants</w:t>
+      </w:r>
+    </w:p>
+    <w:p>
+      <w:pPr>
+        <w:rPr>
+          <w:b/>
+          <w:bCs/>
+        </w:rPr>
+      </w:pPr>
+      <w:r>
+        <w:rPr>
+          <w:b/>
+          <w:bCs/>
+        </w:rPr>
+        <w:t>NavBar</w:t>
+      </w:r>
+    </w:p>
+    <w:p>
+      <w:r>
+        <w:t>Responsabilité</w:t>
+      </w:r>
+      <w:r>
+        <w:t>: afficher les liens de navigation entre les sections et indiquer visuellement la section active</w:t>
       </w:r>
       <w:r>
         <w:t xml:space="preserve">. </w:t>
       </w:r>
       <w:r>
-        <w:t>Arbre des composants (première version)</w:t>
-      </w:r>
-    </w:p>
-    <w:p>
-      <w:pPr>
-        <w:rPr>
-          <w:b/>
-          <w:bCs/>
-        </w:rPr>
-      </w:pPr>
-      <w:r>
-        <w:rPr>
-          <w:b/>
-          <w:bCs/>
-        </w:rPr>
-        <w:t>App</w:t>
-      </w:r>
-    </w:p>
-    <w:p>
-      <w:r>
-        <w:t>Responsabilité: contient le state principal de l'application (section active, liste des projets, filtre actif) et distribue les données aux enfants</w:t>
-      </w:r>
-    </w:p>
-    <w:p>
-      <w:pPr>
-        <w:rPr>
-          <w:b/>
-          <w:bCs/>
-        </w:rPr>
-      </w:pPr>
-      <w:proofErr w:type="spellStart"/>
-      <w:r>
-        <w:rPr>
-          <w:b/>
-          <w:bCs/>
-        </w:rPr>
-        <w:t>NavBar</w:t>
-      </w:r>
-      <w:proofErr w:type="spellEnd"/>
-    </w:p>
-    <w:p>
+        <w:t>Reçoit</w:t>
+      </w:r>
+      <w:r>
+        <w:t xml:space="preserve"> en props </w:t>
+      </w:r>
+      <w:r>
+        <w:t xml:space="preserve">la </w:t>
+      </w:r>
+      <w:r>
+        <w:t>section</w:t>
+      </w:r>
+      <w:r>
+        <w:t xml:space="preserve"> a</w:t>
+      </w:r>
+      <w:r>
+        <w:t xml:space="preserve">ctive, </w:t>
+      </w:r>
+      <w:r>
+        <w:t xml:space="preserve">et pour </w:t>
+      </w:r>
+      <w:r>
+        <w:t>changer</w:t>
+      </w:r>
+      <w:r>
+        <w:t xml:space="preserve"> la s</w:t>
+      </w:r>
+      <w:r>
+        <w:t>ection</w:t>
+      </w:r>
+    </w:p>
+    <w:p>
+      <w:pPr>
+        <w:rPr>
+          <w:b/>
+          <w:bCs/>
+        </w:rPr>
+      </w:pPr>
+      <w:r>
+        <w:rPr>
+          <w:b/>
+          <w:bCs/>
+        </w:rPr>
+        <w:t>Accueil</w:t>
+      </w:r>
+    </w:p>
+    <w:p>
+      <w:r>
+        <w:t>Responsabilité</w:t>
+      </w:r>
       <w:r>
         <w:t xml:space="preserve"> </w:t>
       </w:r>
       <w:r>
+        <w:t>présenter</w:t>
+      </w:r>
+      <w:r>
+        <w:t xml:space="preserve"> l'agence et donner une vue d'ensemble de ses </w:t>
+      </w:r>
+      <w:r>
+        <w:t xml:space="preserve">activités </w:t>
+      </w:r>
+      <w:r>
+        <w:t>affiche seulement quand section</w:t>
+      </w:r>
+      <w:r>
+        <w:t xml:space="preserve"> a</w:t>
+      </w:r>
+      <w:r>
+        <w:t>ctive vaut accueil</w:t>
+      </w:r>
+    </w:p>
+    <w:p>
+      <w:pPr>
+        <w:rPr>
+          <w:b/>
+          <w:bCs/>
+        </w:rPr>
+      </w:pPr>
+      <w:r>
+        <w:rPr>
+          <w:b/>
+          <w:bCs/>
+        </w:rPr>
+        <w:t>P</w:t>
+      </w:r>
+      <w:r>
+        <w:rPr>
+          <w:b/>
+          <w:bCs/>
+        </w:rPr>
+        <w:t>rojets</w:t>
+      </w:r>
+    </w:p>
+    <w:p>
+      <w:r>
+        <w:t>R</w:t>
+      </w:r>
+      <w:r>
+        <w:t xml:space="preserve">esponsabilite: gerer l'affichage de la liste des projets, le filtre actif et le retrait d'un projet recoit en props </w:t>
+      </w:r>
+      <w:r>
+        <w:t xml:space="preserve">la </w:t>
+      </w:r>
+      <w:r>
+        <w:t>liste</w:t>
+      </w:r>
+      <w:r>
+        <w:t xml:space="preserve"> des p</w:t>
+      </w:r>
+      <w:r>
+        <w:t>rojets</w:t>
+      </w:r>
+      <w:r>
+        <w:t>.</w:t>
+      </w:r>
+    </w:p>
+    <w:p>
+      <w:pPr>
+        <w:rPr>
+          <w:b/>
+          <w:bCs/>
+        </w:rPr>
+      </w:pPr>
+      <w:r>
+        <w:rPr>
+          <w:b/>
+          <w:bCs/>
+        </w:rPr>
+        <w:t>FiltreProjets</w:t>
+      </w:r>
+    </w:p>
+    <w:p>
+      <w:r>
+        <w:t>R</w:t>
+      </w:r>
+      <w:r>
+        <w:t>esponsabilite: afficher les options de filtre et indiquer laquelle est activ</w:t>
+      </w:r>
+      <w:r>
+        <w:t>e. R</w:t>
+      </w:r>
+      <w:r>
+        <w:t>ecoit en props</w:t>
+      </w:r>
+      <w:r>
+        <w:t xml:space="preserve"> </w:t>
+      </w:r>
+      <w:r>
+        <w:t>le filtre</w:t>
+      </w:r>
+      <w:r>
+        <w:t xml:space="preserve"> a</w:t>
+      </w:r>
+      <w:r>
+        <w:t>ctif</w:t>
+      </w:r>
+      <w:r>
+        <w:t xml:space="preserve"> et pour</w:t>
+      </w:r>
+      <w:r>
+        <w:t xml:space="preserve"> changer</w:t>
+      </w:r>
+      <w:r>
+        <w:t xml:space="preserve"> le f</w:t>
+      </w:r>
+      <w:r>
+        <w:t>iltre</w:t>
+      </w:r>
+    </w:p>
+    <w:p>
+      <w:pPr>
+        <w:rPr>
+          <w:b/>
+          <w:bCs/>
+        </w:rPr>
+      </w:pPr>
+      <w:r>
+        <w:rPr>
+          <w:b/>
+          <w:bCs/>
+        </w:rPr>
+        <w:t>ListeProjets</w:t>
+      </w:r>
+    </w:p>
+    <w:p>
+      <w:r>
         <w:t>Responsabilité</w:t>
       </w:r>
       <w:r>
-        <w:t>: afficher les liens de navigation entre les sections et indiquer visuellement la section active</w:t>
-      </w:r>
-      <w:r>
-        <w:t xml:space="preserve">. </w:t>
-      </w:r>
-      <w:r>
-        <w:t>Reçoit</w:t>
-      </w:r>
-      <w:r>
-        <w:t xml:space="preserve"> en </w:t>
-      </w:r>
-      <w:proofErr w:type="spellStart"/>
-      <w:r>
-        <w:t>props</w:t>
-      </w:r>
-      <w:proofErr w:type="spellEnd"/>
-      <w:r>
-        <w:t xml:space="preserve"> </w:t>
-      </w:r>
-      <w:r>
-        <w:t xml:space="preserve">la </w:t>
-      </w:r>
-      <w:r>
-        <w:t>section</w:t>
+        <w:t xml:space="preserve">: transformer la liste </w:t>
+      </w:r>
+      <w:r>
+        <w:t>filtrée</w:t>
+      </w:r>
+      <w:r>
+        <w:t xml:space="preserve"> de projets en une </w:t>
+      </w:r>
+      <w:r>
+        <w:t>série</w:t>
+      </w:r>
+      <w:r>
+        <w:t xml:space="preserve"> de cartes, ou afficher un message si la liste est vide recoit en props</w:t>
+      </w:r>
+      <w:r>
+        <w:t xml:space="preserve"> les </w:t>
+      </w:r>
+      <w:r>
+        <w:t>projets</w:t>
       </w:r>
       <w:r>
         <w:t xml:space="preserve"> a</w:t>
       </w:r>
       <w:r>
-        <w:t xml:space="preserve">ctive, </w:t>
-      </w:r>
-      <w:r>
-        <w:t xml:space="preserve">et pour </w:t>
-      </w:r>
-      <w:r>
-        <w:t>changer</w:t>
-      </w:r>
-      <w:r>
-        <w:t xml:space="preserve"> la s</w:t>
-      </w:r>
-      <w:r>
-        <w:t>ection</w:t>
-      </w:r>
-    </w:p>
-    <w:p>
-      <w:pPr>
-        <w:rPr>
-          <w:b/>
-          <w:bCs/>
-        </w:rPr>
-      </w:pPr>
-      <w:r>
-        <w:rPr>
-          <w:b/>
-          <w:bCs/>
-        </w:rPr>
-        <w:t>Accueil</w:t>
-      </w:r>
-    </w:p>
-    <w:p>
-      <w:r>
-        <w:t>Responsabilité</w:t>
-      </w:r>
-      <w:r>
-        <w:t xml:space="preserve"> </w:t>
-      </w:r>
-      <w:r>
-        <w:t>présenter</w:t>
-      </w:r>
-      <w:r>
-        <w:t xml:space="preserve"> l'agence et donner une vue d'ensemble de ses </w:t>
-      </w:r>
-      <w:r>
-        <w:t xml:space="preserve">activités </w:t>
-      </w:r>
-      <w:r>
-        <w:t>affiche seulement quand section</w:t>
-      </w:r>
-      <w:r>
-        <w:t xml:space="preserve"> a</w:t>
-      </w:r>
-      <w:r>
-        <w:t>ctive vaut accueil</w:t>
-      </w:r>
-    </w:p>
-    <w:p>
-      <w:pPr>
-        <w:rPr>
-          <w:b/>
-          <w:bCs/>
-        </w:rPr>
-      </w:pPr>
-      <w:r>
-        <w:rPr>
-          <w:b/>
-          <w:bCs/>
-        </w:rPr>
-        <w:t>P</w:t>
-      </w:r>
-      <w:r>
-        <w:rPr>
-          <w:b/>
-          <w:bCs/>
-        </w:rPr>
-        <w:t>rojets</w:t>
-      </w:r>
-    </w:p>
-    <w:p>
-      <w:proofErr w:type="spellStart"/>
-      <w:r>
-        <w:t>R</w:t>
-      </w:r>
-      <w:r>
-        <w:t>esponsabilite</w:t>
-      </w:r>
-      <w:proofErr w:type="spellEnd"/>
-      <w:r>
-        <w:t xml:space="preserve">: </w:t>
-      </w:r>
-      <w:proofErr w:type="spellStart"/>
-      <w:r>
-        <w:t>gerer</w:t>
-      </w:r>
-      <w:proofErr w:type="spellEnd"/>
-      <w:r>
-        <w:t xml:space="preserve"> l'affichage de la liste des projets, le filtre actif et le retrait d'un projet </w:t>
-      </w:r>
-      <w:proofErr w:type="spellStart"/>
-      <w:r>
-        <w:t>recoit</w:t>
-      </w:r>
-      <w:proofErr w:type="spellEnd"/>
-      <w:r>
-        <w:t xml:space="preserve"> en </w:t>
-      </w:r>
-      <w:proofErr w:type="spellStart"/>
-      <w:r>
-        <w:t>props</w:t>
-      </w:r>
-      <w:proofErr w:type="spellEnd"/>
-      <w:r>
-        <w:t xml:space="preserve"> </w:t>
-      </w:r>
-      <w:r>
-        <w:t xml:space="preserve">la </w:t>
-      </w:r>
-      <w:r>
-        <w:t>liste</w:t>
-      </w:r>
-      <w:r>
-        <w:t xml:space="preserve"> des p</w:t>
-      </w:r>
-      <w:r>
-        <w:t>rojets</w:t>
-      </w:r>
-      <w:r>
-        <w:t>.</w:t>
-      </w:r>
-    </w:p>
-    <w:p>
-      <w:pPr>
-        <w:rPr>
-          <w:b/>
-          <w:bCs/>
-        </w:rPr>
-      </w:pPr>
-      <w:proofErr w:type="spellStart"/>
-      <w:r>
-        <w:rPr>
-          <w:b/>
-          <w:bCs/>
-        </w:rPr>
-        <w:t>FiltreProjets</w:t>
-      </w:r>
-      <w:proofErr w:type="spellEnd"/>
-    </w:p>
-    <w:p>
-      <w:proofErr w:type="spellStart"/>
-      <w:r>
-        <w:t>R</w:t>
-      </w:r>
-      <w:r>
-        <w:t>esponsabilite</w:t>
-      </w:r>
-      <w:proofErr w:type="spellEnd"/>
-      <w:r>
-        <w:t>: afficher les options de filtre et indiquer laquelle est activ</w:t>
-      </w:r>
-      <w:r>
-        <w:t xml:space="preserve">e. </w:t>
-      </w:r>
-      <w:proofErr w:type="spellStart"/>
-      <w:r>
-        <w:t>R</w:t>
-      </w:r>
-      <w:r>
-        <w:t>ecoit</w:t>
-      </w:r>
-      <w:proofErr w:type="spellEnd"/>
-      <w:r>
-        <w:t xml:space="preserve"> en </w:t>
-      </w:r>
-      <w:proofErr w:type="spellStart"/>
-      <w:r>
-        <w:t>props</w:t>
-      </w:r>
-      <w:proofErr w:type="spellEnd"/>
-      <w:r>
-        <w:t xml:space="preserve"> </w:t>
-      </w:r>
-      <w:r>
-        <w:t>le filtre</w:t>
-      </w:r>
-      <w:r>
-        <w:t xml:space="preserve"> a</w:t>
-      </w:r>
-      <w:r>
-        <w:t>ctif</w:t>
+        <w:t>ffiches</w:t>
       </w:r>
       <w:r>
         <w:t xml:space="preserve"> et pour</w:t>
       </w:r>
       <w:r>
-        <w:t xml:space="preserve"> changer</w:t>
-      </w:r>
-      <w:r>
-        <w:t xml:space="preserve"> le f</w:t>
-      </w:r>
-      <w:r>
-        <w:t>iltre</w:t>
-      </w:r>
-    </w:p>
-    <w:p>
-      <w:pPr>
-        <w:rPr>
-          <w:b/>
-          <w:bCs/>
-        </w:rPr>
-      </w:pPr>
-      <w:proofErr w:type="spellStart"/>
-      <w:r>
-        <w:rPr>
-          <w:b/>
-          <w:bCs/>
-        </w:rPr>
-        <w:t>ListeProjets</w:t>
-      </w:r>
-      <w:proofErr w:type="spellEnd"/>
-    </w:p>
-    <w:p>
-      <w:r>
-        <w:t>Responsabilité</w:t>
-      </w:r>
-      <w:r>
-        <w:t xml:space="preserve">: transformer la liste </w:t>
-      </w:r>
-      <w:r>
-        <w:t>filtrée</w:t>
-      </w:r>
-      <w:r>
-        <w:t xml:space="preserve"> de projets en une </w:t>
-      </w:r>
-      <w:r>
-        <w:t>série</w:t>
-      </w:r>
-      <w:r>
-        <w:t xml:space="preserve"> de cartes, ou afficher un message si la liste est vide </w:t>
-      </w:r>
-      <w:proofErr w:type="spellStart"/>
-      <w:r>
-        <w:t>recoit</w:t>
-      </w:r>
-      <w:proofErr w:type="spellEnd"/>
-      <w:r>
-        <w:t xml:space="preserve"> en </w:t>
-      </w:r>
-      <w:proofErr w:type="spellStart"/>
-      <w:r>
-        <w:t>props</w:t>
-      </w:r>
-      <w:proofErr w:type="spellEnd"/>
-      <w:r>
-        <w:t xml:space="preserve"> les </w:t>
-      </w:r>
-      <w:r>
-        <w:t>projets</w:t>
-      </w:r>
-      <w:r>
-        <w:t xml:space="preserve"> a</w:t>
-      </w:r>
-      <w:r>
-        <w:t>ffiches</w:t>
-      </w:r>
-      <w:r>
-        <w:t xml:space="preserve"> et pour</w:t>
-      </w:r>
-      <w:r>
         <w:t xml:space="preserve"> retirer</w:t>
       </w:r>
       <w:r>
@@ -1366,7 +1270,6 @@
       </w:r>
     </w:p>
     <w:p>
-      <w:proofErr w:type="spellStart"/>
       <w:r>
         <w:rPr>
           <w:b/>
@@ -1374,7 +1277,6 @@
         </w:rPr>
         <w:t>ProjetCard</w:t>
       </w:r>
-      <w:proofErr w:type="spellEnd"/>
       <w:r>
         <w:t xml:space="preserve"> </w:t>
       </w:r>
@@ -1396,19 +1298,9 @@
       <w:r>
         <w:t xml:space="preserve"> </w:t>
       </w:r>
-      <w:proofErr w:type="spellStart"/>
-      <w:r>
-        <w:t>recoit</w:t>
-      </w:r>
-      <w:proofErr w:type="spellEnd"/>
-      <w:r>
-        <w:t xml:space="preserve"> en </w:t>
-      </w:r>
-      <w:proofErr w:type="spellStart"/>
-      <w:r>
-        <w:t>props</w:t>
-      </w:r>
-      <w:proofErr w:type="spellEnd"/>
+      <w:r>
+        <w:t>recoit en props</w:t>
+      </w:r>
       <w:r>
         <w:t xml:space="preserve"> le </w:t>
       </w:r>
@@ -1470,7 +1362,6 @@
           <w:bCs/>
         </w:rPr>
       </w:pPr>
-      <w:proofErr w:type="spellStart"/>
       <w:r>
         <w:rPr>
           <w:b/>
@@ -1478,7 +1369,6 @@
         </w:rPr>
         <w:t>APropos</w:t>
       </w:r>
-      <w:proofErr w:type="spellEnd"/>
     </w:p>
     <w:p>
       <w:r>
@@ -1517,23 +1407,20 @@
       <w:r>
         <w:t xml:space="preserve"> </w:t>
       </w:r>
-      <w:proofErr w:type="spellStart"/>
       <w:r>
         <w:t>AP</w:t>
       </w:r>
       <w:r>
         <w:t>ropos</w:t>
       </w:r>
-      <w:proofErr w:type="spellEnd"/>
-    </w:p>
-    <w:p>
-      <w:pPr>
-        <w:rPr>
-          <w:b/>
-          <w:bCs/>
-        </w:rPr>
-      </w:pPr>
-      <w:proofErr w:type="spellStart"/>
+    </w:p>
+    <w:p>
+      <w:pPr>
+        <w:rPr>
+          <w:b/>
+          <w:bCs/>
+        </w:rPr>
+      </w:pPr>
       <w:r>
         <w:rPr>
           <w:b/>
@@ -1541,7 +1428,6 @@
         </w:rPr>
         <w:t>NousJoindre</w:t>
       </w:r>
-      <w:proofErr w:type="spellEnd"/>
       <w:r>
         <w:rPr>
           <w:b/>
@@ -1599,16 +1485,11 @@
       </w:r>
     </w:p>
     <w:p>
-      <w:proofErr w:type="spellStart"/>
       <w:r>
         <w:t>R</w:t>
       </w:r>
       <w:r>
-        <w:t>esponsabilite</w:t>
-      </w:r>
-      <w:proofErr w:type="spellEnd"/>
-      <w:r>
-        <w:t xml:space="preserve">: afficher les informations de bas de page, communes </w:t>
+        <w:t xml:space="preserve">esponsabilite: afficher les informations de bas de page, communes </w:t>
       </w:r>
       <w:r>
         <w:t>à</w:t>
@@ -1626,7 +1507,6 @@
           <w:szCs w:val="24"/>
         </w:rPr>
       </w:pPr>
-      <w:proofErr w:type="spellStart"/>
       <w:r>
         <w:rPr>
           <w:b/>
@@ -1634,17 +1514,7 @@
           <w:sz w:val="24"/>
           <w:szCs w:val="24"/>
         </w:rPr>
-        <w:t>Elements</w:t>
-      </w:r>
-      <w:proofErr w:type="spellEnd"/>
-      <w:r>
-        <w:rPr>
-          <w:b/>
-          <w:bCs/>
-          <w:sz w:val="24"/>
-          <w:szCs w:val="24"/>
-        </w:rPr>
-        <w:t xml:space="preserve"> </w:t>
+        <w:t xml:space="preserve">Elements </w:t>
       </w:r>
       <w:r>
         <w:rPr>
@@ -1673,11 +1543,9 @@
           <w:numId w:val="4"/>
         </w:numPr>
       </w:pPr>
-      <w:proofErr w:type="spellStart"/>
       <w:r>
         <w:t>ProjetCard</w:t>
       </w:r>
-      <w:proofErr w:type="spellEnd"/>
     </w:p>
     <w:p>
       <w:pPr>
@@ -1687,73 +1555,68 @@
           <w:numId w:val="4"/>
         </w:numPr>
       </w:pPr>
-      <w:proofErr w:type="spellStart"/>
-      <w:r>
-        <w:t>NavBar</w:t>
-      </w:r>
-      <w:proofErr w:type="spellEnd"/>
-      <w:r>
+      <w:r>
+        <w:t xml:space="preserve">NavBar </w:t>
+      </w:r>
+    </w:p>
+    <w:p>
+      <w:pPr>
+        <w:rPr>
+          <w:b/>
+          <w:bCs/>
+        </w:rPr>
+      </w:pPr>
+      <w:r>
+        <w:rPr>
+          <w:b/>
+          <w:bCs/>
+        </w:rPr>
+        <w:t>Évolution</w:t>
+      </w:r>
+      <w:r>
+        <w:rPr>
+          <w:b/>
+          <w:bCs/>
+        </w:rPr>
         <w:t xml:space="preserve"> </w:t>
       </w:r>
-    </w:p>
-    <w:p>
-      <w:pPr>
-        <w:rPr>
-          <w:b/>
-          <w:bCs/>
-        </w:rPr>
-      </w:pPr>
-      <w:r>
-        <w:rPr>
-          <w:b/>
-          <w:bCs/>
-        </w:rPr>
-        <w:t>Évolution</w:t>
-      </w:r>
-      <w:r>
-        <w:rPr>
-          <w:b/>
-          <w:bCs/>
-        </w:rPr>
+      <w:r>
+        <w:rPr>
+          <w:b/>
+          <w:bCs/>
+        </w:rPr>
+        <w:t>prévue</w:t>
+      </w:r>
+    </w:p>
+    <w:p>
+      <w:r>
+        <w:t xml:space="preserve">L'arbre pourra changer une fois le code de </w:t>
+      </w:r>
+      <w:r>
+        <w:t>départ</w:t>
+      </w:r>
+      <w:r>
+        <w:t xml:space="preserve"> explore, par exemple</w:t>
+      </w:r>
+      <w:r>
         <w:t xml:space="preserve"> </w:t>
       </w:r>
       <w:r>
-        <w:rPr>
-          <w:b/>
-          <w:bCs/>
-        </w:rPr>
-        <w:t>prévue</w:t>
-      </w:r>
-    </w:p>
-    <w:p>
-      <w:r>
-        <w:t xml:space="preserve">L'arbre pourra changer une fois le code de </w:t>
-      </w:r>
-      <w:r>
-        <w:t>départ</w:t>
-      </w:r>
-      <w:r>
-        <w:t xml:space="preserve"> explore, par exemple</w:t>
+        <w:t xml:space="preserve">si une section </w:t>
+      </w:r>
+      <w:r>
+        <w:t>mérite</w:t>
+      </w:r>
+      <w:r>
+        <w:t xml:space="preserve"> d'</w:t>
+      </w:r>
+      <w:r>
+        <w:t>être</w:t>
       </w:r>
       <w:r>
         <w:t xml:space="preserve"> </w:t>
       </w:r>
       <w:r>
-        <w:t xml:space="preserve">si une section </w:t>
-      </w:r>
-      <w:r>
-        <w:t>mérite</w:t>
-      </w:r>
-      <w:r>
-        <w:t xml:space="preserve"> d'</w:t>
-      </w:r>
-      <w:r>
-        <w:t>être</w:t>
-      </w:r>
-      <w:r>
-        <w:t xml:space="preserve"> </w:t>
-      </w:r>
-      <w:r>
         <w:t>divisée</w:t>
       </w:r>
       <w:r>
@@ -1777,16 +1640,28 @@
         <w:t> :</w:t>
       </w:r>
       <w:r>
-        <w:t xml:space="preserve"> </w:t>
-      </w:r>
-      <w:r>
-        <w:t>L</w:t>
+        <w:t xml:space="preserve"> L</w:t>
       </w:r>
       <w:r>
         <w:t>e code de départ</w:t>
       </w:r>
       <w:r>
         <w:t>.</w:t>
+      </w:r>
+    </w:p>
+    <w:p>
+      <w:pPr>
+        <w:rPr>
+          <w:b/>
+          <w:bCs/>
+        </w:rPr>
+      </w:pPr>
+      <w:r>
+        <w:rPr>
+          <w:b/>
+          <w:bCs/>
+        </w:rPr>
+        <w:t>Dans App.js</w:t>
       </w:r>
     </w:p>
     <w:p>
@@ -1794,11 +1669,11 @@
         <w:pStyle w:val="Paragraphedeliste"/>
         <w:numPr>
           <w:ilvl w:val="0"/>
-          <w:numId w:val="5"/>
+          <w:numId w:val="6"/>
         </w:numPr>
       </w:pPr>
       <w:r>
-        <w:t>Ménage initiale</w:t>
+        <w:t>Import : "./components/Acceuil" au lieu de "./components/Accueil".</w:t>
       </w:r>
     </w:p>
     <w:p>
@@ -1806,11 +1681,156 @@
         <w:pStyle w:val="Paragraphedeliste"/>
         <w:numPr>
           <w:ilvl w:val="0"/>
-          <w:numId w:val="5"/>
+          <w:numId w:val="6"/>
         </w:numPr>
       </w:pPr>
       <w:r>
-        <w:t xml:space="preserve">Erreurs remarques : </w:t>
+        <w:t xml:space="preserve">Prop mal </w:t>
+      </w:r>
+      <w:r>
+        <w:t>nommée</w:t>
+      </w:r>
+      <w:r>
+        <w:t xml:space="preserve"> : App.js envoie "titreSite" mais Accueil attend "titre".</w:t>
+      </w:r>
+    </w:p>
+    <w:p>
+      <w:pPr>
+        <w:pStyle w:val="Paragraphedeliste"/>
+        <w:numPr>
+          <w:ilvl w:val="0"/>
+          <w:numId w:val="6"/>
+        </w:numPr>
+      </w:pPr>
+      <w:r>
+        <w:t xml:space="preserve">Fonction non </w:t>
+      </w:r>
+      <w:r>
+        <w:t>appelée</w:t>
+      </w:r>
+      <w:r>
+        <w:t xml:space="preserve"> : onChanger={() =&gt; changerMessage} renvoie la fonction sans l'</w:t>
+      </w:r>
+      <w:r>
+        <w:t>exécuter</w:t>
+      </w:r>
+      <w:r>
+        <w:t>, au lieu de onChanger={changerMessage}.</w:t>
+      </w:r>
+    </w:p>
+    <w:p>
+      <w:pPr>
+        <w:rPr>
+          <w:b/>
+          <w:bCs/>
+        </w:rPr>
+      </w:pPr>
+      <w:r>
+        <w:rPr>
+          <w:b/>
+          <w:bCs/>
+        </w:rPr>
+        <w:t>Dans Accueil.js</w:t>
+      </w:r>
+    </w:p>
+    <w:p>
+      <w:pPr>
+        <w:pStyle w:val="Paragraphedeliste"/>
+        <w:numPr>
+          <w:ilvl w:val="0"/>
+          <w:numId w:val="7"/>
+        </w:numPr>
+      </w:pPr>
+      <w:r>
+        <w:t>Import CSS casse : "./Acceuil.css" au lieu de "./Accueil.css".</w:t>
+      </w:r>
+    </w:p>
+    <w:p>
+      <w:pPr>
+        <w:pStyle w:val="Paragraphedeliste"/>
+        <w:numPr>
+          <w:ilvl w:val="0"/>
+          <w:numId w:val="7"/>
+        </w:numPr>
+      </w:pPr>
+      <w:r>
+        <w:t>Evenement mal ecrit : onclick={onChanger} au lieu de onClick={onChanger}.</w:t>
+      </w:r>
+    </w:p>
+    <w:p>
+      <w:pPr>
+        <w:rPr>
+          <w:b/>
+          <w:bCs/>
+        </w:rPr>
+      </w:pPr>
+      <w:r>
+        <w:rPr>
+          <w:b/>
+          <w:bCs/>
+        </w:rPr>
+        <w:t>Dans Accueil.css</w:t>
+      </w:r>
+    </w:p>
+    <w:p>
+      <w:pPr>
+        <w:pStyle w:val="Paragraphedeliste"/>
+        <w:numPr>
+          <w:ilvl w:val="0"/>
+          <w:numId w:val="8"/>
+        </w:numPr>
+      </w:pPr>
+      <w:r>
+        <w:t>Classe mal nommee : ".heros" au lieu de ".hero" (ne correspondait pas au className utilise dans Accueil.js).</w:t>
+      </w:r>
+    </w:p>
+    <w:p>
+      <w:pPr>
+        <w:pStyle w:val="Paragraphedeliste"/>
+        <w:numPr>
+          <w:ilvl w:val="0"/>
+          <w:numId w:val="8"/>
+        </w:numPr>
+      </w:pPr>
+      <w:r>
+        <w:t>Propriete CSS mal ecrite : "background-colour" au lieu de "background-color".</w:t>
+      </w:r>
+    </w:p>
+    <w:p>
+      <w:pPr>
+        <w:pStyle w:val="Paragraphedeliste"/>
+        <w:numPr>
+          <w:ilvl w:val="0"/>
+          <w:numId w:val="8"/>
+        </w:numPr>
+      </w:pPr>
+      <w:r>
+        <w:t>Propriete CSS mal ecrite : "font-weigth" au lieu de "font-weight".</w:t>
+      </w:r>
+    </w:p>
+    <w:p>
+      <w:pPr>
+        <w:pStyle w:val="Paragraphedeliste"/>
+        <w:numPr>
+          <w:ilvl w:val="0"/>
+          <w:numId w:val="8"/>
+        </w:numPr>
+      </w:pPr>
+      <w:r>
+        <w:t>Valeur invalide : "text-align: centers" au lieu de "text-align: center".</w:t>
+      </w:r>
+    </w:p>
+    <w:p>
+      <w:pPr>
+        <w:pStyle w:val="Paragraphedeliste"/>
+        <w:numPr>
+          <w:ilvl w:val="0"/>
+          <w:numId w:val="8"/>
+        </w:numPr>
+      </w:pPr>
+      <w:r>
+        <w:lastRenderedPageBreak/>
+        <w:t>Unite manquante : "padding: 30" au lieu de "padding: 30px".</w:t>
       </w:r>
     </w:p>
     <w:sectPr>
@@ -1826,6 +1846,232 @@
 <file path=word/numbering.xml><?xml version="1.0" encoding="utf-8"?>
 <w:numbering xmlns:wpc="http://schemas.microsoft.com/office/word/2010/wordprocessingCanvas" xmlns:cx="http://schemas.microsoft.com/office/drawing/2014/chartex" xmlns:cx1="http://schemas.microsoft.com/office/drawing/2015/9/8/chartex" xmlns:cx2="http://schemas.microsoft.com/office/drawing/2015/10/21/chartex" xmlns:cx3="http://schemas.microsoft.com/office/drawing/2016/5/9/chartex" xmlns:cx4="http://schemas.microsoft.com/office/drawing/2016/5/10/chartex" xmlns:cx5="http://schemas.microsoft.com/office/drawing/2016/5/11/chartex" xmlns:cx6="http://schemas.microsoft.com/office/drawing/2016/5/12/chartex" xmlns:cx7="http://schemas.microsoft.com/office/drawing/2016/5/13/chartex" xmlns:cx8="http://schemas.microsoft.com/office/drawing/2016/5/14/chartex" xmlns:mc="http://schemas.openxmlformats.org/markup-compatibility/2006" xmlns:aink="http://schemas.microsoft.com/office/drawing/2016/ink" xmlns:am3d="http://schemas.microsoft.com/office/drawing/2017/model3d" xmlns:o="urn:schemas-microsoft-com:office:office" xmlns:oel="http://schemas.microsoft.com/office/2019/extlst" xmlns:r="http://schemas.openxmlformats.org/officeDocument/2006/relationships" xmlns:m="http://schemas.openxmlformats.org/officeDocument/2006/math" xmlns:v="urn:schemas-microsoft-com:vml" xmlns:wp14="http://schemas.microsoft.com/office/word/2010/wordprocessingDrawing" xmlns:wp="http://schemas.openxmlformats.org/drawingml/2006/wordprocessingDrawing" xmlns:w10="urn:schemas-microsoft-com:office:word" xmlns:w="http://schemas.openxmlformats.org/wordprocessingml/2006/main" xmlns:w14="http://schemas.microsoft.com/office/word/2010/wordml" xmlns:w15="http://schemas.microsoft.com/office/word/2012/wordml" xmlns:w16cex="http://schemas.microsoft.com/office/word/2018/wordml/cex" xmlns:w16cid="http://schemas.microsoft.com/office/word/2016/wordml/cid" xmlns:w16="http://schemas.microsoft.com/office/word/2018/wordml" xmlns:w16du="http://schemas.microsoft.com/office/word/2023/wordml/word16du" xmlns:w16sdtdh="http://schemas.microsoft.com/office/word/2020/wordml/sdtdatahash" xmlns:w16sdtfl="http://schemas.microsoft.com/office/word/2024/wordml/sdtformatlock" xmlns:w16se="http://schemas.microsoft.com/office/word/2015/wordml/symex" xmlns:wpg="http://schemas.microsoft.com/office/word/2010/wordprocessingGroup" xmlns:wpi="http://schemas.microsoft.com/office/word/2010/wordprocessingInk" xmlns:wne="http://schemas.microsoft.com/office/word/2006/wordml" xmlns:wps="http://schemas.microsoft.com/office/word/2010/wordprocessingShape" mc:Ignorable="w14 w15 w16se w16cid w16 w16cex w16sdtdh w16sdtfl w16du wp14">
   <w:abstractNum w:abstractNumId="0" w15:restartNumberingAfterBreak="0">
+    <w:nsid w:val="15E11B44"/>
+    <w:multiLevelType w:val="hybridMultilevel"/>
+    <w:tmpl w:val="88E64204"/>
+    <w:lvl w:ilvl="0" w:tplc="0C0C0001">
+      <w:start w:val="1"/>
+      <w:numFmt w:val="bullet"/>
+      <w:lvlText w:val=""/>
+      <w:lvlJc w:val="left"/>
+      <w:pPr>
+        <w:ind w:left="720" w:hanging="360"/>
+      </w:pPr>
+      <w:rPr>
+        <w:rFonts w:ascii="Symbol" w:hAnsi="Symbol" w:hint="default"/>
+      </w:rPr>
+    </w:lvl>
+    <w:lvl w:ilvl="1" w:tplc="0C0C0003" w:tentative="1">
+      <w:start w:val="1"/>
+      <w:numFmt w:val="bullet"/>
+      <w:lvlText w:val="o"/>
+      <w:lvlJc w:val="left"/>
+      <w:pPr>
+        <w:ind w:left="1440" w:hanging="360"/>
+      </w:pPr>
+      <w:rPr>
+        <w:rFonts w:ascii="Courier New" w:hAnsi="Courier New" w:cs="Courier New" w:hint="default"/>
+      </w:rPr>
+    </w:lvl>
+    <w:lvl w:ilvl="2" w:tplc="0C0C0005" w:tentative="1">
+      <w:start w:val="1"/>
+      <w:numFmt w:val="bullet"/>
+      <w:lvlText w:val=""/>
+      <w:lvlJc w:val="left"/>
+      <w:pPr>
+        <w:ind w:left="2160" w:hanging="360"/>
+      </w:pPr>
+      <w:rPr>
+        <w:rFonts w:ascii="Wingdings" w:hAnsi="Wingdings" w:hint="default"/>
+      </w:rPr>
+    </w:lvl>
+    <w:lvl w:ilvl="3" w:tplc="0C0C0001" w:tentative="1">
+      <w:start w:val="1"/>
+      <w:numFmt w:val="bullet"/>
+      <w:lvlText w:val=""/>
+      <w:lvlJc w:val="left"/>
+      <w:pPr>
+        <w:ind w:left="2880" w:hanging="360"/>
+      </w:pPr>
+      <w:rPr>
+        <w:rFonts w:ascii="Symbol" w:hAnsi="Symbol" w:hint="default"/>
+      </w:rPr>
+    </w:lvl>
+    <w:lvl w:ilvl="4" w:tplc="0C0C0003" w:tentative="1">
+      <w:start w:val="1"/>
+      <w:numFmt w:val="bullet"/>
+      <w:lvlText w:val="o"/>
+      <w:lvlJc w:val="left"/>
+      <w:pPr>
+        <w:ind w:left="3600" w:hanging="360"/>
+      </w:pPr>
+      <w:rPr>
+        <w:rFonts w:ascii="Courier New" w:hAnsi="Courier New" w:cs="Courier New" w:hint="default"/>
+      </w:rPr>
+    </w:lvl>
+    <w:lvl w:ilvl="5" w:tplc="0C0C0005" w:tentative="1">
+      <w:start w:val="1"/>
+      <w:numFmt w:val="bullet"/>
+      <w:lvlText w:val=""/>
+      <w:lvlJc w:val="left"/>
+      <w:pPr>
+        <w:ind w:left="4320" w:hanging="360"/>
+      </w:pPr>
+      <w:rPr>
+        <w:rFonts w:ascii="Wingdings" w:hAnsi="Wingdings" w:hint="default"/>
+      </w:rPr>
+    </w:lvl>
+    <w:lvl w:ilvl="6" w:tplc="0C0C0001" w:tentative="1">
+      <w:start w:val="1"/>
+      <w:numFmt w:val="bullet"/>
+      <w:lvlText w:val=""/>
+      <w:lvlJc w:val="left"/>
+      <w:pPr>
+        <w:ind w:left="5040" w:hanging="360"/>
+      </w:pPr>
+      <w:rPr>
+        <w:rFonts w:ascii="Symbol" w:hAnsi="Symbol" w:hint="default"/>
+      </w:rPr>
+    </w:lvl>
+    <w:lvl w:ilvl="7" w:tplc="0C0C0003" w:tentative="1">
+      <w:start w:val="1"/>
+      <w:numFmt w:val="bullet"/>
+      <w:lvlText w:val="o"/>
+      <w:lvlJc w:val="left"/>
+      <w:pPr>
+        <w:ind w:left="5760" w:hanging="360"/>
+      </w:pPr>
+      <w:rPr>
+        <w:rFonts w:ascii="Courier New" w:hAnsi="Courier New" w:cs="Courier New" w:hint="default"/>
+      </w:rPr>
+    </w:lvl>
+    <w:lvl w:ilvl="8" w:tplc="0C0C0005" w:tentative="1">
+      <w:start w:val="1"/>
+      <w:numFmt w:val="bullet"/>
+      <w:lvlText w:val=""/>
+      <w:lvlJc w:val="left"/>
+      <w:pPr>
+        <w:ind w:left="6480" w:hanging="360"/>
+      </w:pPr>
+      <w:rPr>
+        <w:rFonts w:ascii="Wingdings" w:hAnsi="Wingdings" w:hint="default"/>
+      </w:rPr>
+    </w:lvl>
+  </w:abstractNum>
+  <w:abstractNum w:abstractNumId="1" w15:restartNumberingAfterBreak="0">
+    <w:nsid w:val="2D944887"/>
+    <w:multiLevelType w:val="hybridMultilevel"/>
+    <w:tmpl w:val="442475F8"/>
+    <w:lvl w:ilvl="0" w:tplc="0C0C0001">
+      <w:start w:val="1"/>
+      <w:numFmt w:val="bullet"/>
+      <w:lvlText w:val=""/>
+      <w:lvlJc w:val="left"/>
+      <w:pPr>
+        <w:ind w:left="720" w:hanging="360"/>
+      </w:pPr>
+      <w:rPr>
+        <w:rFonts w:ascii="Symbol" w:hAnsi="Symbol" w:hint="default"/>
+      </w:rPr>
+    </w:lvl>
+    <w:lvl w:ilvl="1" w:tplc="0C0C0003" w:tentative="1">
+      <w:start w:val="1"/>
+      <w:numFmt w:val="bullet"/>
+      <w:lvlText w:val="o"/>
+      <w:lvlJc w:val="left"/>
+      <w:pPr>
+        <w:ind w:left="1440" w:hanging="360"/>
+      </w:pPr>
+      <w:rPr>
+        <w:rFonts w:ascii="Courier New" w:hAnsi="Courier New" w:cs="Courier New" w:hint="default"/>
+      </w:rPr>
+    </w:lvl>
+    <w:lvl w:ilvl="2" w:tplc="0C0C0005" w:tentative="1">
+      <w:start w:val="1"/>
+      <w:numFmt w:val="bullet"/>
+      <w:lvlText w:val=""/>
+      <w:lvlJc w:val="left"/>
+      <w:pPr>
+        <w:ind w:left="2160" w:hanging="360"/>
+      </w:pPr>
+      <w:rPr>
+        <w:rFonts w:ascii="Wingdings" w:hAnsi="Wingdings" w:hint="default"/>
+      </w:rPr>
+    </w:lvl>
+    <w:lvl w:ilvl="3" w:tplc="0C0C0001" w:tentative="1">
+      <w:start w:val="1"/>
+      <w:numFmt w:val="bullet"/>
+      <w:lvlText w:val=""/>
+      <w:lvlJc w:val="left"/>
+      <w:pPr>
+        <w:ind w:left="2880" w:hanging="360"/>
+      </w:pPr>
+      <w:rPr>
+        <w:rFonts w:ascii="Symbol" w:hAnsi="Symbol" w:hint="default"/>
+      </w:rPr>
+    </w:lvl>
+    <w:lvl w:ilvl="4" w:tplc="0C0C0003" w:tentative="1">
+      <w:start w:val="1"/>
+      <w:numFmt w:val="bullet"/>
+      <w:lvlText w:val="o"/>
+      <w:lvlJc w:val="left"/>
+      <w:pPr>
+        <w:ind w:left="3600" w:hanging="360"/>
+      </w:pPr>
+      <w:rPr>
+        <w:rFonts w:ascii="Courier New" w:hAnsi="Courier New" w:cs="Courier New" w:hint="default"/>
+      </w:rPr>
+    </w:lvl>
+    <w:lvl w:ilvl="5" w:tplc="0C0C0005" w:tentative="1">
+      <w:start w:val="1"/>
+      <w:numFmt w:val="bullet"/>
+      <w:lvlText w:val=""/>
+      <w:lvlJc w:val="left"/>
+      <w:pPr>
+        <w:ind w:left="4320" w:hanging="360"/>
+      </w:pPr>
+      <w:rPr>
+        <w:rFonts w:ascii="Wingdings" w:hAnsi="Wingdings" w:hint="default"/>
+      </w:rPr>
+    </w:lvl>
+    <w:lvl w:ilvl="6" w:tplc="0C0C0001" w:tentative="1">
+      <w:start w:val="1"/>
+      <w:numFmt w:val="bullet"/>
+      <w:lvlText w:val=""/>
+      <w:lvlJc w:val="left"/>
+      <w:pPr>
+        <w:ind w:left="5040" w:hanging="360"/>
+      </w:pPr>
+      <w:rPr>
+        <w:rFonts w:ascii="Symbol" w:hAnsi="Symbol" w:hint="default"/>
+      </w:rPr>
+    </w:lvl>
+    <w:lvl w:ilvl="7" w:tplc="0C0C0003" w:tentative="1">
+      <w:start w:val="1"/>
+      <w:numFmt w:val="bullet"/>
+      <w:lvlText w:val="o"/>
+      <w:lvlJc w:val="left"/>
+      <w:pPr>
+        <w:ind w:left="5760" w:hanging="360"/>
+      </w:pPr>
+      <w:rPr>
+        <w:rFonts w:ascii="Courier New" w:hAnsi="Courier New" w:cs="Courier New" w:hint="default"/>
+      </w:rPr>
+    </w:lvl>
+    <w:lvl w:ilvl="8" w:tplc="0C0C0005" w:tentative="1">
+      <w:start w:val="1"/>
+      <w:numFmt w:val="bullet"/>
+      <w:lvlText w:val=""/>
+      <w:lvlJc w:val="left"/>
+      <w:pPr>
+        <w:ind w:left="6480" w:hanging="360"/>
+      </w:pPr>
+      <w:rPr>
+        <w:rFonts w:ascii="Wingdings" w:hAnsi="Wingdings" w:hint="default"/>
+      </w:rPr>
+    </w:lvl>
+  </w:abstractNum>
+  <w:abstractNum w:abstractNumId="2" w15:restartNumberingAfterBreak="0">
     <w:nsid w:val="2DA726E4"/>
     <w:multiLevelType w:val="hybridMultilevel"/>
     <w:tmpl w:val="4E1603DE"/>
@@ -1938,7 +2184,7 @@
       </w:rPr>
     </w:lvl>
   </w:abstractNum>
-  <w:abstractNum w:abstractNumId="1" w15:restartNumberingAfterBreak="0">
+  <w:abstractNum w:abstractNumId="3" w15:restartNumberingAfterBreak="0">
     <w:nsid w:val="48FF2865"/>
     <w:multiLevelType w:val="hybridMultilevel"/>
     <w:tmpl w:val="A4526698"/>
@@ -2051,7 +2297,7 @@
       </w:rPr>
     </w:lvl>
   </w:abstractNum>
-  <w:abstractNum w:abstractNumId="2" w15:restartNumberingAfterBreak="0">
+  <w:abstractNum w:abstractNumId="4" w15:restartNumberingAfterBreak="0">
     <w:nsid w:val="4CA33F7B"/>
     <w:multiLevelType w:val="hybridMultilevel"/>
     <w:tmpl w:val="5DD2A532"/>
@@ -2164,7 +2410,7 @@
       </w:rPr>
     </w:lvl>
   </w:abstractNum>
-  <w:abstractNum w:abstractNumId="3" w15:restartNumberingAfterBreak="0">
+  <w:abstractNum w:abstractNumId="5" w15:restartNumberingAfterBreak="0">
     <w:nsid w:val="508B17E0"/>
     <w:multiLevelType w:val="hybridMultilevel"/>
     <w:tmpl w:val="697ACF8E"/>
@@ -2277,7 +2523,120 @@
       </w:rPr>
     </w:lvl>
   </w:abstractNum>
-  <w:abstractNum w:abstractNumId="4" w15:restartNumberingAfterBreak="0">
+  <w:abstractNum w:abstractNumId="6" w15:restartNumberingAfterBreak="0">
+    <w:nsid w:val="598225C8"/>
+    <w:multiLevelType w:val="hybridMultilevel"/>
+    <w:tmpl w:val="5FC80350"/>
+    <w:lvl w:ilvl="0" w:tplc="0C0C0001">
+      <w:start w:val="1"/>
+      <w:numFmt w:val="bullet"/>
+      <w:lvlText w:val=""/>
+      <w:lvlJc w:val="left"/>
+      <w:pPr>
+        <w:ind w:left="720" w:hanging="360"/>
+      </w:pPr>
+      <w:rPr>
+        <w:rFonts w:ascii="Symbol" w:hAnsi="Symbol" w:hint="default"/>
+      </w:rPr>
+    </w:lvl>
+    <w:lvl w:ilvl="1" w:tplc="0C0C0003" w:tentative="1">
+      <w:start w:val="1"/>
+      <w:numFmt w:val="bullet"/>
+      <w:lvlText w:val="o"/>
+      <w:lvlJc w:val="left"/>
+      <w:pPr>
+        <w:ind w:left="1440" w:hanging="360"/>
+      </w:pPr>
+      <w:rPr>
+        <w:rFonts w:ascii="Courier New" w:hAnsi="Courier New" w:cs="Courier New" w:hint="default"/>
+      </w:rPr>
+    </w:lvl>
+    <w:lvl w:ilvl="2" w:tplc="0C0C0005" w:tentative="1">
+      <w:start w:val="1"/>
+      <w:numFmt w:val="bullet"/>
+      <w:lvlText w:val=""/>
+      <w:lvlJc w:val="left"/>
+      <w:pPr>
+        <w:ind w:left="2160" w:hanging="360"/>
+      </w:pPr>
+      <w:rPr>
+        <w:rFonts w:ascii="Wingdings" w:hAnsi="Wingdings" w:hint="default"/>
+      </w:rPr>
+    </w:lvl>
+    <w:lvl w:ilvl="3" w:tplc="0C0C0001" w:tentative="1">
+      <w:start w:val="1"/>
+      <w:numFmt w:val="bullet"/>
+      <w:lvlText w:val=""/>
+      <w:lvlJc w:val="left"/>
+      <w:pPr>
+        <w:ind w:left="2880" w:hanging="360"/>
+      </w:pPr>
+      <w:rPr>
+        <w:rFonts w:ascii="Symbol" w:hAnsi="Symbol" w:hint="default"/>
+      </w:rPr>
+    </w:lvl>
+    <w:lvl w:ilvl="4" w:tplc="0C0C0003" w:tentative="1">
+      <w:start w:val="1"/>
+      <w:numFmt w:val="bullet"/>
+      <w:lvlText w:val="o"/>
+      <w:lvlJc w:val="left"/>
+      <w:pPr>
+        <w:ind w:left="3600" w:hanging="360"/>
+      </w:pPr>
+      <w:rPr>
+        <w:rFonts w:ascii="Courier New" w:hAnsi="Courier New" w:cs="Courier New" w:hint="default"/>
+      </w:rPr>
+    </w:lvl>
+    <w:lvl w:ilvl="5" w:tplc="0C0C0005" w:tentative="1">
+      <w:start w:val="1"/>
+      <w:numFmt w:val="bullet"/>
+      <w:lvlText w:val=""/>
+      <w:lvlJc w:val="left"/>
+      <w:pPr>
+        <w:ind w:left="4320" w:hanging="360"/>
+      </w:pPr>
+      <w:rPr>
+        <w:rFonts w:ascii="Wingdings" w:hAnsi="Wingdings" w:hint="default"/>
+      </w:rPr>
+    </w:lvl>
+    <w:lvl w:ilvl="6" w:tplc="0C0C0001" w:tentative="1">
+      <w:start w:val="1"/>
+      <w:numFmt w:val="bullet"/>
+      <w:lvlText w:val=""/>
+      <w:lvlJc w:val="left"/>
+      <w:pPr>
+        <w:ind w:left="5040" w:hanging="360"/>
+      </w:pPr>
+      <w:rPr>
+        <w:rFonts w:ascii="Symbol" w:hAnsi="Symbol" w:hint="default"/>
+      </w:rPr>
+    </w:lvl>
+    <w:lvl w:ilvl="7" w:tplc="0C0C0003" w:tentative="1">
+      <w:start w:val="1"/>
+      <w:numFmt w:val="bullet"/>
+      <w:lvlText w:val="o"/>
+      <w:lvlJc w:val="left"/>
+      <w:pPr>
+        <w:ind w:left="5760" w:hanging="360"/>
+      </w:pPr>
+      <w:rPr>
+        <w:rFonts w:ascii="Courier New" w:hAnsi="Courier New" w:cs="Courier New" w:hint="default"/>
+      </w:rPr>
+    </w:lvl>
+    <w:lvl w:ilvl="8" w:tplc="0C0C0005" w:tentative="1">
+      <w:start w:val="1"/>
+      <w:numFmt w:val="bullet"/>
+      <w:lvlText w:val=""/>
+      <w:lvlJc w:val="left"/>
+      <w:pPr>
+        <w:ind w:left="6480" w:hanging="360"/>
+      </w:pPr>
+      <w:rPr>
+        <w:rFonts w:ascii="Wingdings" w:hAnsi="Wingdings" w:hint="default"/>
+      </w:rPr>
+    </w:lvl>
+  </w:abstractNum>
+  <w:abstractNum w:abstractNumId="7" w15:restartNumberingAfterBreak="0">
     <w:nsid w:val="75D3749B"/>
     <w:multiLevelType w:val="hybridMultilevel"/>
     <w:tmpl w:val="82F8E244"/>
@@ -2391,19 +2750,28 @@
     </w:lvl>
   </w:abstractNum>
   <w:num w:numId="1" w16cid:durableId="8799778">
+    <w:abstractNumId w:val="4"/>
+  </w:num>
+  <w:num w:numId="2" w16cid:durableId="1255479645">
+    <w:abstractNumId w:val="3"/>
+  </w:num>
+  <w:num w:numId="3" w16cid:durableId="1411730032">
+    <w:abstractNumId w:val="7"/>
+  </w:num>
+  <w:num w:numId="4" w16cid:durableId="633170729">
+    <w:abstractNumId w:val="5"/>
+  </w:num>
+  <w:num w:numId="5" w16cid:durableId="1636981620">
     <w:abstractNumId w:val="2"/>
   </w:num>
-  <w:num w:numId="2" w16cid:durableId="1255479645">
+  <w:num w:numId="6" w16cid:durableId="780950101">
     <w:abstractNumId w:val="1"/>
   </w:num>
-  <w:num w:numId="3" w16cid:durableId="1411730032">
-    <w:abstractNumId w:val="4"/>
+  <w:num w:numId="7" w16cid:durableId="1109155986">
+    <w:abstractNumId w:val="0"/>
   </w:num>
-  <w:num w:numId="4" w16cid:durableId="633170729">
-    <w:abstractNumId w:val="3"/>
-  </w:num>
-  <w:num w:numId="5" w16cid:durableId="1636981620">
-    <w:abstractNumId w:val="0"/>
+  <w:num w:numId="8" w16cid:durableId="634873914">
+    <w:abstractNumId w:val="6"/>
   </w:num>
 </w:numbering>
 </file>
@@ -3009,6 +3377,7 @@
   <w:style w:type="character" w:default="1" w:styleId="Policepardfaut">
     <w:name w:val="Default Paragraph Font"/>
     <w:uiPriority w:val="1"/>
+    <w:semiHidden/>
     <w:unhideWhenUsed/>
   </w:style>
   <w:style w:type="table" w:default="1" w:styleId="TableauNormal">

</xml_diff>